<commit_message>
Gm edits on research proposal
</commit_message>
<xml_diff>
--- a/ResearchProposal.docx
+++ b/ResearchProposal.docx
@@ -1,6 +1,6 @@
 
 <file path=word/document.xml><?xml version="1.0" encoding="utf-8"?>
-<w:document xmlns:wpc="http://schemas.microsoft.com/office/word/2010/wordprocessingCanvas" xmlns:cx="http://schemas.microsoft.com/office/drawing/2014/chartex" xmlns:cx1="http://schemas.microsoft.com/office/drawing/2015/9/8/chartex" xmlns:cx2="http://schemas.microsoft.com/office/drawing/2015/10/21/chartex" xmlns:cx3="http://schemas.microsoft.com/office/drawing/2016/5/9/chartex" xmlns:cx4="http://schemas.microsoft.com/office/drawing/2016/5/10/chartex" xmlns:cx5="http://schemas.microsoft.com/office/drawing/2016/5/11/chartex" xmlns:cx6="http://schemas.microsoft.com/office/drawing/2016/5/12/chartex" xmlns:cx7="http://schemas.microsoft.com/office/drawing/2016/5/13/chartex" xmlns:cx8="http://schemas.microsoft.com/office/drawing/2016/5/14/chartex" xmlns:mc="http://schemas.openxmlformats.org/markup-compatibility/2006" xmlns:aink="http://schemas.microsoft.com/office/drawing/2016/ink" xmlns:am3d="http://schemas.microsoft.com/office/drawing/2017/model3d" xmlns:o="urn:schemas-microsoft-com:office:office" xmlns:r="http://schemas.openxmlformats.org/officeDocument/2006/relationships" xmlns:m="http://schemas.openxmlformats.org/officeDocument/2006/math" xmlns:v="urn:schemas-microsoft-com:vml" xmlns:wp14="http://schemas.microsoft.com/office/word/2010/wordprocessingDrawing" xmlns:wp="http://schemas.openxmlformats.org/drawingml/2006/wordprocessingDrawing" xmlns:w10="urn:schemas-microsoft-com:office:word" xmlns:w="http://schemas.openxmlformats.org/wordprocessingml/2006/main" xmlns:w14="http://schemas.microsoft.com/office/word/2010/wordml" xmlns:w15="http://schemas.microsoft.com/office/word/2012/wordml" xmlns:w16cid="http://schemas.microsoft.com/office/word/2016/wordml/cid" xmlns:w16se="http://schemas.microsoft.com/office/word/2015/wordml/symex" xmlns:wpg="http://schemas.microsoft.com/office/word/2010/wordprocessingGroup" xmlns:wpi="http://schemas.microsoft.com/office/word/2010/wordprocessingInk" xmlns:wne="http://schemas.microsoft.com/office/word/2006/wordml" xmlns:wps="http://schemas.microsoft.com/office/word/2010/wordprocessingShape" mc:Ignorable="w14 w15 w16se w16cid wp14">
+<w:document xmlns:wpc="http://schemas.microsoft.com/office/word/2010/wordprocessingCanvas" xmlns:mo="http://schemas.microsoft.com/office/mac/office/2008/main" xmlns:mc="http://schemas.openxmlformats.org/markup-compatibility/2006" xmlns:mv="urn:schemas-microsoft-com:mac:vml" xmlns:o="urn:schemas-microsoft-com:office:office" xmlns:r="http://schemas.openxmlformats.org/officeDocument/2006/relationships" xmlns:m="http://schemas.openxmlformats.org/officeDocument/2006/math" xmlns:v="urn:schemas-microsoft-com:vml" xmlns:wp14="http://schemas.microsoft.com/office/word/2010/wordprocessingDrawing" xmlns:wp="http://schemas.openxmlformats.org/drawingml/2006/wordprocessingDrawing" xmlns:w10="urn:schemas-microsoft-com:office:word" xmlns:w="http://schemas.openxmlformats.org/wordprocessingml/2006/main" xmlns:w14="http://schemas.microsoft.com/office/word/2010/wordml" xmlns:w15="http://schemas.microsoft.com/office/word/2012/wordml" xmlns:wpg="http://schemas.microsoft.com/office/word/2010/wordprocessingGroup" xmlns:wpi="http://schemas.microsoft.com/office/word/2010/wordprocessingInk" xmlns:wne="http://schemas.microsoft.com/office/word/2006/wordml" xmlns:wps="http://schemas.microsoft.com/office/word/2010/wordprocessingShape" mc:Ignorable="w14 w15 wp14">
   <w:background w:color="FFFFFF"/>
   <w:body>
     <w:p>
@@ -144,8 +144,34 @@
           <w:sz w:val="24"/>
           <w:szCs w:val="24"/>
         </w:rPr>
-        <w:t>Institution</w:t>
-      </w:r>
+        <w:t xml:space="preserve">Institution: </w:t>
+      </w:r>
+      <w:r>
+        <w:rPr>
+          <w:rFonts w:ascii="Times" w:hAnsi="Times" w:cs="Times New Roman"/>
+          <w:sz w:val="24"/>
+          <w:szCs w:val="24"/>
+        </w:rPr>
+        <w:t>University of California, Santa Barbara</w:t>
+      </w:r>
+    </w:p>
+    <w:p>
+      <w:pPr>
+        <w:rPr>
+          <w:rFonts w:ascii="Times" w:hAnsi="Times" w:cs="Times New Roman"/>
+          <w:sz w:val="24"/>
+          <w:szCs w:val="24"/>
+        </w:rPr>
+      </w:pPr>
+    </w:p>
+    <w:p>
+      <w:pPr>
+        <w:rPr>
+          <w:rFonts w:ascii="Times" w:hAnsi="Times" w:cs="Times New Roman"/>
+          <w:sz w:val="24"/>
+          <w:szCs w:val="24"/>
+        </w:rPr>
+      </w:pPr>
       <w:r>
         <w:rPr>
           <w:rFonts w:ascii="Times" w:hAnsi="Times" w:cs="Times New Roman"/>
@@ -153,8 +179,60 @@
           <w:sz w:val="24"/>
           <w:szCs w:val="24"/>
         </w:rPr>
-        <w:t>:</w:t>
-      </w:r>
+        <w:t xml:space="preserve">Research Question: </w:t>
+      </w:r>
+      <w:r>
+        <w:rPr>
+          <w:rFonts w:ascii="Times" w:hAnsi="Times" w:cs="Times New Roman"/>
+          <w:sz w:val="24"/>
+          <w:szCs w:val="24"/>
+        </w:rPr>
+        <w:t xml:space="preserve">What is the </w:t>
+      </w:r>
+      <w:r>
+        <w:rPr>
+          <w:rFonts w:ascii="Times" w:hAnsi="Times" w:cs="Times New Roman"/>
+          <w:sz w:val="24"/>
+          <w:szCs w:val="24"/>
+        </w:rPr>
+        <w:t xml:space="preserve">economic </w:t>
+      </w:r>
+      <w:ins w:id="0" w:author="Gavin McDonald" w:date="2018-04-12T11:01:00Z">
+        <w:r>
+          <w:rPr>
+            <w:rFonts w:ascii="Times" w:hAnsi="Times" w:cs="Times New Roman"/>
+            <w:sz w:val="24"/>
+            <w:szCs w:val="24"/>
+          </w:rPr>
+          <w:t xml:space="preserve">and environmental </w:t>
+        </w:r>
+      </w:ins>
+      <w:r>
+        <w:rPr>
+          <w:rFonts w:ascii="Times" w:hAnsi="Times" w:cs="Times New Roman"/>
+          <w:sz w:val="24"/>
+          <w:szCs w:val="24"/>
+        </w:rPr>
+        <w:t xml:space="preserve">impact of piracy on global shipping? </w:t>
+      </w:r>
+    </w:p>
+    <w:p>
+      <w:pPr>
+        <w:rPr>
+          <w:rFonts w:ascii="Times" w:hAnsi="Times" w:cs="Times New Roman"/>
+          <w:sz w:val="24"/>
+          <w:szCs w:val="24"/>
+        </w:rPr>
+      </w:pPr>
+    </w:p>
+    <w:p>
+      <w:pPr>
+        <w:rPr>
+          <w:rFonts w:ascii="Times" w:hAnsi="Times" w:cs="Times New Roman"/>
+          <w:sz w:val="24"/>
+          <w:szCs w:val="24"/>
+        </w:rPr>
+      </w:pPr>
       <w:r>
         <w:rPr>
           <w:rFonts w:ascii="Times" w:hAnsi="Times" w:cs="Times New Roman"/>
@@ -162,6 +240,188 @@
           <w:sz w:val="24"/>
           <w:szCs w:val="24"/>
         </w:rPr>
+        <w:t>Motivation</w:t>
+      </w:r>
+      <w:r>
+        <w:rPr>
+          <w:rFonts w:ascii="Times" w:hAnsi="Times" w:cs="Times New Roman"/>
+          <w:sz w:val="24"/>
+          <w:szCs w:val="24"/>
+        </w:rPr>
+        <w:t xml:space="preserve">: </w:t>
+      </w:r>
+      <w:r>
+        <w:rPr>
+          <w:rFonts w:ascii="Times" w:hAnsi="Times" w:cs="Times New Roman"/>
+          <w:sz w:val="24"/>
+          <w:szCs w:val="24"/>
+        </w:rPr>
+        <w:t xml:space="preserve">As pointed out by Adam Smith in </w:t>
+      </w:r>
+      <w:r>
+        <w:rPr>
+          <w:rFonts w:ascii="Times" w:hAnsi="Times" w:cs="Times New Roman"/>
+          <w:sz w:val="24"/>
+          <w:szCs w:val="24"/>
+        </w:rPr>
+        <w:t xml:space="preserve">his </w:t>
+      </w:r>
+      <w:r>
+        <w:rPr>
+          <w:rFonts w:ascii="Times" w:hAnsi="Times" w:cs="Times New Roman"/>
+          <w:sz w:val="24"/>
+          <w:szCs w:val="24"/>
+        </w:rPr>
+        <w:t>foundational work The Wealth of Nations: “Coastal areas, and cities on rivers have been the fastest to develop, as their goods can be very cheaply transported across water versus land.</w:t>
+      </w:r>
+      <w:r>
+        <w:rPr>
+          <w:rFonts w:ascii="Times" w:hAnsi="Times" w:cs="Times New Roman"/>
+          <w:sz w:val="24"/>
+          <w:szCs w:val="24"/>
+        </w:rPr>
+        <w:t xml:space="preserve">” This statement holds true today, with most metropolitan areas worldwide located adjacent to rivers or ports, and maritime transportation remaining as one of the most cost-efficient methods for </w:t>
+      </w:r>
+      <w:r>
+        <w:rPr>
+          <w:rFonts w:ascii="Times" w:hAnsi="Times" w:cs="Times New Roman"/>
+          <w:sz w:val="24"/>
+          <w:szCs w:val="24"/>
+        </w:rPr>
+        <w:t xml:space="preserve">international </w:t>
+      </w:r>
+      <w:r>
+        <w:rPr>
+          <w:rFonts w:ascii="Times" w:hAnsi="Times" w:cs="Times New Roman"/>
+          <w:sz w:val="24"/>
+          <w:szCs w:val="24"/>
+        </w:rPr>
+        <w:t>trade. Maritime transport, however, has been historically prone to the criminal intervention</w:t>
+      </w:r>
+      <w:r>
+        <w:rPr>
+          <w:rFonts w:ascii="Times" w:hAnsi="Times" w:cs="Times New Roman"/>
+          <w:sz w:val="24"/>
+          <w:szCs w:val="24"/>
+        </w:rPr>
+        <w:t xml:space="preserve"> in the form of piracy</w:t>
+      </w:r>
+      <w:r>
+        <w:rPr>
+          <w:rFonts w:ascii="Times" w:hAnsi="Times" w:cs="Times New Roman"/>
+          <w:sz w:val="24"/>
+          <w:szCs w:val="24"/>
+        </w:rPr>
+        <w:t xml:space="preserve">. Rough assessments for the impact of modern piracy </w:t>
+      </w:r>
+      <w:r>
+        <w:rPr>
+          <w:rFonts w:ascii="Times" w:hAnsi="Times" w:cs="Times New Roman"/>
+          <w:sz w:val="24"/>
+          <w:szCs w:val="24"/>
+        </w:rPr>
+        <w:t>point to losses exceeding</w:t>
+      </w:r>
+      <w:r>
+        <w:rPr>
+          <w:rFonts w:ascii="Times" w:hAnsi="Times" w:cs="Times New Roman"/>
+          <w:sz w:val="24"/>
+          <w:szCs w:val="24"/>
+        </w:rPr>
+        <w:t xml:space="preserve"> 10 billion per year</w:t>
+      </w:r>
+      <w:r>
+        <w:rPr>
+          <w:rFonts w:ascii="Times" w:hAnsi="Times" w:cs="Times New Roman"/>
+          <w:sz w:val="24"/>
+          <w:szCs w:val="24"/>
+        </w:rPr>
+        <w:t xml:space="preserve"> worldwide</w:t>
+      </w:r>
+      <w:r>
+        <w:rPr>
+          <w:rFonts w:ascii="Times" w:hAnsi="Times" w:cs="Times New Roman"/>
+          <w:sz w:val="24"/>
+          <w:szCs w:val="24"/>
+        </w:rPr>
+        <w:t xml:space="preserve"> (</w:t>
+      </w:r>
+      <w:proofErr w:type="spellStart"/>
+      <w:r>
+        <w:rPr>
+          <w:rFonts w:ascii="Times" w:hAnsi="Times" w:cs="Times New Roman"/>
+          <w:sz w:val="24"/>
+          <w:szCs w:val="24"/>
+        </w:rPr>
+        <w:t>Luft</w:t>
+      </w:r>
+      <w:proofErr w:type="spellEnd"/>
+      <w:r>
+        <w:rPr>
+          <w:rFonts w:ascii="Times" w:hAnsi="Times" w:cs="Times New Roman"/>
+          <w:sz w:val="24"/>
+          <w:szCs w:val="24"/>
+        </w:rPr>
+        <w:t xml:space="preserve"> and </w:t>
+      </w:r>
+      <w:proofErr w:type="spellStart"/>
+      <w:r>
+        <w:rPr>
+          <w:rFonts w:ascii="Times" w:hAnsi="Times" w:cs="Times New Roman"/>
+          <w:sz w:val="24"/>
+          <w:szCs w:val="24"/>
+        </w:rPr>
+        <w:t>Corin</w:t>
+      </w:r>
+      <w:proofErr w:type="spellEnd"/>
+      <w:r>
+        <w:rPr>
+          <w:rFonts w:ascii="Times" w:hAnsi="Times" w:cs="Times New Roman"/>
+          <w:sz w:val="24"/>
+          <w:szCs w:val="24"/>
+        </w:rPr>
+        <w:t xml:space="preserve"> 2004), </w:t>
+      </w:r>
+      <w:r>
+        <w:rPr>
+          <w:rFonts w:ascii="Times" w:hAnsi="Times" w:cs="Times New Roman"/>
+          <w:sz w:val="24"/>
+          <w:szCs w:val="24"/>
+        </w:rPr>
+        <w:t xml:space="preserve">with most attacks taking place in the </w:t>
+      </w:r>
+      <w:r>
+        <w:rPr>
+          <w:rFonts w:ascii="Times" w:hAnsi="Times" w:cs="Times New Roman"/>
+          <w:sz w:val="24"/>
+          <w:szCs w:val="24"/>
+        </w:rPr>
+        <w:t xml:space="preserve">Straits of Malacca, West Africa, the waters off Somalia, </w:t>
+      </w:r>
+      <w:ins w:id="1" w:author="Gavin McDonald" w:date="2018-04-12T11:03:00Z">
+        <w:r>
+          <w:rPr>
+            <w:rFonts w:ascii="Times" w:hAnsi="Times" w:cs="Times New Roman"/>
+            <w:sz w:val="24"/>
+            <w:szCs w:val="24"/>
+          </w:rPr>
+          <w:t xml:space="preserve">the Coral Triangle, </w:t>
+        </w:r>
+      </w:ins>
+      <w:r>
+        <w:rPr>
+          <w:rFonts w:ascii="Times" w:hAnsi="Times" w:cs="Times New Roman"/>
+          <w:sz w:val="24"/>
+          <w:szCs w:val="24"/>
+        </w:rPr>
+        <w:t>Chittagong and the Indian Ocean.</w:t>
+      </w:r>
+      <w:r>
+        <w:rPr>
+          <w:rFonts w:ascii="Times" w:hAnsi="Times" w:cs="Times New Roman"/>
+          <w:sz w:val="24"/>
+          <w:szCs w:val="24"/>
+        </w:rPr>
         <w:t xml:space="preserve"> </w:t>
       </w:r>
       <w:r>
@@ -170,7 +430,49 @@
           <w:sz w:val="24"/>
           <w:szCs w:val="24"/>
         </w:rPr>
-        <w:t>University of California, Santa Barbara</w:t>
+        <w:t xml:space="preserve">To </w:t>
+      </w:r>
+      <w:del w:id="2" w:author="Gavin McDonald" w:date="2018-04-12T11:03:00Z">
+        <w:r>
+          <w:rPr>
+            <w:rFonts w:ascii="Times" w:hAnsi="Times" w:cs="Times New Roman"/>
+            <w:sz w:val="24"/>
+            <w:szCs w:val="24"/>
+          </w:rPr>
+          <w:delText xml:space="preserve">this </w:delText>
+        </w:r>
+      </w:del>
+      <w:r>
+        <w:rPr>
+          <w:rFonts w:ascii="Times" w:hAnsi="Times" w:cs="Times New Roman"/>
+          <w:sz w:val="24"/>
+          <w:szCs w:val="24"/>
+        </w:rPr>
+        <w:t xml:space="preserve">date, however, there is no </w:t>
+      </w:r>
+      <w:r>
+        <w:rPr>
+          <w:rFonts w:ascii="Times" w:hAnsi="Times" w:cs="Times New Roman"/>
+          <w:sz w:val="24"/>
+          <w:szCs w:val="24"/>
+        </w:rPr>
+        <w:t xml:space="preserve">unifying literature linking theoretical </w:t>
+      </w:r>
+      <w:r>
+        <w:rPr>
+          <w:rFonts w:ascii="Times" w:hAnsi="Times" w:cs="Times New Roman"/>
+          <w:sz w:val="24"/>
+          <w:szCs w:val="24"/>
+        </w:rPr>
+        <w:t>and empirical behavior of shippers and pirates to establish the causal effect of piracy on the shipping industry</w:t>
+      </w:r>
+      <w:r>
+        <w:rPr>
+          <w:rFonts w:ascii="Times" w:hAnsi="Times" w:cs="Times New Roman"/>
+          <w:sz w:val="24"/>
+          <w:szCs w:val="24"/>
+        </w:rPr>
+        <w:t>.</w:t>
       </w:r>
     </w:p>
     <w:p>
@@ -197,23 +499,255 @@
           <w:sz w:val="24"/>
           <w:szCs w:val="24"/>
         </w:rPr>
-        <w:t xml:space="preserve">Research Question: </w:t>
-      </w:r>
-      <w:r>
-        <w:rPr>
-          <w:rFonts w:ascii="Times" w:hAnsi="Times" w:cs="Times New Roman"/>
-          <w:sz w:val="24"/>
-          <w:szCs w:val="24"/>
-        </w:rPr>
-        <w:t xml:space="preserve">What is the </w:t>
-      </w:r>
-      <w:r>
-        <w:rPr>
-          <w:rFonts w:ascii="Times" w:hAnsi="Times" w:cs="Times New Roman"/>
-          <w:sz w:val="24"/>
-          <w:szCs w:val="24"/>
-        </w:rPr>
-        <w:t xml:space="preserve">economic impact of piracy on global shipping? </w:t>
+        <w:t>Results</w:t>
+      </w:r>
+      <w:r>
+        <w:rPr>
+          <w:rFonts w:ascii="Times" w:hAnsi="Times" w:cs="Times New Roman"/>
+          <w:sz w:val="24"/>
+          <w:szCs w:val="24"/>
+        </w:rPr>
+        <w:t xml:space="preserve">: </w:t>
+      </w:r>
+      <w:r>
+        <w:rPr>
+          <w:rFonts w:ascii="Times" w:hAnsi="Times" w:cs="Times New Roman"/>
+          <w:sz w:val="24"/>
+          <w:szCs w:val="24"/>
+        </w:rPr>
+        <w:t xml:space="preserve">In this paper, we aim to </w:t>
+      </w:r>
+      <w:r>
+        <w:rPr>
+          <w:rFonts w:ascii="Times" w:hAnsi="Times" w:cs="Times New Roman"/>
+          <w:sz w:val="24"/>
+          <w:szCs w:val="24"/>
+        </w:rPr>
+        <w:t xml:space="preserve">unify the sparse theoretical literature with data available for both shipping routes and pirate attacks to credibly assess the causal effect of piracy on the shipping industry. To achieve this goal, we update theoretical insights to include strategic behavior across and between shippers and </w:t>
+      </w:r>
+      <w:r>
+        <w:rPr>
+          <w:rFonts w:ascii="Times" w:hAnsi="Times" w:cs="Times New Roman"/>
+          <w:sz w:val="24"/>
+          <w:szCs w:val="24"/>
+        </w:rPr>
+        <w:t>pirates and</w:t>
+      </w:r>
+      <w:r>
+        <w:rPr>
+          <w:rFonts w:ascii="Times" w:hAnsi="Times" w:cs="Times New Roman"/>
+          <w:sz w:val="24"/>
+          <w:szCs w:val="24"/>
+        </w:rPr>
+        <w:t xml:space="preserve"> </w:t>
+      </w:r>
+      <w:del w:id="3" w:author="Gavin McDonald" w:date="2018-04-12T11:04:00Z">
+        <w:r>
+          <w:rPr>
+            <w:rFonts w:ascii="Times" w:hAnsi="Times" w:cs="Times New Roman"/>
+            <w:sz w:val="24"/>
+            <w:szCs w:val="24"/>
+          </w:rPr>
+          <w:delText xml:space="preserve">collect </w:delText>
+        </w:r>
+      </w:del>
+      <w:ins w:id="4" w:author="Gavin McDonald" w:date="2018-04-12T11:04:00Z">
+        <w:r>
+          <w:rPr>
+            <w:rFonts w:ascii="Times" w:hAnsi="Times" w:cs="Times New Roman"/>
+            <w:sz w:val="24"/>
+            <w:szCs w:val="24"/>
+          </w:rPr>
+          <w:t>compile</w:t>
+        </w:r>
+        <w:r>
+          <w:rPr>
+            <w:rFonts w:ascii="Times" w:hAnsi="Times" w:cs="Times New Roman"/>
+            <w:sz w:val="24"/>
+            <w:szCs w:val="24"/>
+          </w:rPr>
+          <w:t xml:space="preserve"> </w:t>
+        </w:r>
+      </w:ins>
+      <w:r>
+        <w:rPr>
+          <w:rFonts w:ascii="Times" w:hAnsi="Times" w:cs="Times New Roman"/>
+          <w:sz w:val="24"/>
+          <w:szCs w:val="24"/>
+        </w:rPr>
+        <w:t xml:space="preserve">a unique geospatial dataset </w:t>
+      </w:r>
+      <w:r>
+        <w:rPr>
+          <w:rFonts w:ascii="Times" w:hAnsi="Times" w:cs="Times New Roman"/>
+          <w:sz w:val="24"/>
+          <w:szCs w:val="24"/>
+        </w:rPr>
+        <w:t xml:space="preserve">to test those insights. </w:t>
+      </w:r>
+      <w:ins w:id="5" w:author="Gavin McDonald" w:date="2018-04-12T11:04:00Z">
+        <w:r>
+          <w:rPr>
+            <w:rFonts w:ascii="Times" w:hAnsi="Times" w:cs="Times New Roman"/>
+            <w:sz w:val="24"/>
+            <w:szCs w:val="24"/>
+          </w:rPr>
+          <w:t>The dataset includes high spatial- and temporal resolut</w:t>
+        </w:r>
+      </w:ins>
+      <w:ins w:id="6" w:author="Gavin McDonald" w:date="2018-04-12T11:05:00Z">
+        <w:r>
+          <w:rPr>
+            <w:rFonts w:ascii="Times" w:hAnsi="Times" w:cs="Times New Roman"/>
+            <w:sz w:val="24"/>
+            <w:szCs w:val="24"/>
+          </w:rPr>
+          <w:t xml:space="preserve">ion information on pirate attacks </w:t>
+        </w:r>
+      </w:ins>
+      <w:ins w:id="7" w:author="Gavin McDonald" w:date="2018-04-12T11:10:00Z">
+        <w:r>
+          <w:rPr>
+            <w:rFonts w:ascii="Times" w:hAnsi="Times" w:cs="Times New Roman"/>
+            <w:sz w:val="24"/>
+            <w:szCs w:val="24"/>
+          </w:rPr>
+          <w:t xml:space="preserve">from the US </w:t>
+        </w:r>
+        <w:r>
+          <w:rPr>
+            <w:rFonts w:ascii="Times" w:hAnsi="Times" w:cs="Times New Roman"/>
+            <w:sz w:val="24"/>
+            <w:szCs w:val="24"/>
+          </w:rPr>
+          <w:t xml:space="preserve">National Geospatial-Intelligence Agency </w:t>
+        </w:r>
+      </w:ins>
+      <w:ins w:id="8" w:author="Gavin McDonald" w:date="2018-04-12T11:08:00Z">
+        <w:r>
+          <w:rPr>
+            <w:rFonts w:ascii="Times" w:hAnsi="Times" w:cs="Times New Roman"/>
+            <w:sz w:val="24"/>
+            <w:szCs w:val="24"/>
+          </w:rPr>
+          <w:t>as well as</w:t>
+        </w:r>
+      </w:ins>
+      <w:ins w:id="9" w:author="Gavin McDonald" w:date="2018-04-12T11:05:00Z">
+        <w:r>
+          <w:rPr>
+            <w:rFonts w:ascii="Times" w:hAnsi="Times" w:cs="Times New Roman"/>
+            <w:sz w:val="24"/>
+            <w:szCs w:val="24"/>
+          </w:rPr>
+          <w:t xml:space="preserve"> individual vessel tracks of </w:t>
+        </w:r>
+      </w:ins>
+      <w:ins w:id="10" w:author="Gavin McDonald" w:date="2018-04-12T11:08:00Z">
+        <w:r>
+          <w:rPr>
+            <w:rFonts w:ascii="Times" w:hAnsi="Times" w:cs="Times New Roman"/>
+            <w:sz w:val="24"/>
+            <w:szCs w:val="24"/>
+          </w:rPr>
+          <w:t xml:space="preserve">all known </w:t>
+        </w:r>
+      </w:ins>
+      <w:ins w:id="11" w:author="Gavin McDonald" w:date="2018-04-12T11:05:00Z">
+        <w:r>
+          <w:rPr>
+            <w:rFonts w:ascii="Times" w:hAnsi="Times" w:cs="Times New Roman"/>
+            <w:sz w:val="24"/>
+            <w:szCs w:val="24"/>
+          </w:rPr>
+          <w:t>cargo and tanker vessels</w:t>
+        </w:r>
+      </w:ins>
+      <w:ins w:id="12" w:author="Gavin McDonald" w:date="2018-04-12T11:08:00Z">
+        <w:r>
+          <w:rPr>
+            <w:rFonts w:ascii="Times" w:hAnsi="Times" w:cs="Times New Roman"/>
+            <w:sz w:val="24"/>
+            <w:szCs w:val="24"/>
+          </w:rPr>
+          <w:t xml:space="preserve"> </w:t>
+        </w:r>
+      </w:ins>
+      <w:ins w:id="13" w:author="Gavin McDonald" w:date="2018-04-12T11:10:00Z">
+        <w:r>
+          <w:rPr>
+            <w:rFonts w:ascii="Times" w:hAnsi="Times" w:cs="Times New Roman"/>
+            <w:sz w:val="24"/>
+            <w:szCs w:val="24"/>
+          </w:rPr>
+          <w:t>that use</w:t>
+        </w:r>
+      </w:ins>
+      <w:ins w:id="14" w:author="Gavin McDonald" w:date="2018-04-12T11:08:00Z">
+        <w:r>
+          <w:rPr>
+            <w:rFonts w:ascii="Times" w:hAnsi="Times" w:cs="Times New Roman"/>
+            <w:sz w:val="24"/>
+            <w:szCs w:val="24"/>
+          </w:rPr>
+          <w:t xml:space="preserve"> the AIS vessel monitoring system</w:t>
+        </w:r>
+      </w:ins>
+      <w:ins w:id="15" w:author="Gavin McDonald" w:date="2018-04-12T11:05:00Z">
+        <w:r>
+          <w:rPr>
+            <w:rFonts w:ascii="Times" w:hAnsi="Times" w:cs="Times New Roman"/>
+            <w:sz w:val="24"/>
+            <w:szCs w:val="24"/>
+          </w:rPr>
+          <w:t xml:space="preserve">. </w:t>
+        </w:r>
+      </w:ins>
+      <w:del w:id="16" w:author="Gavin McDonald" w:date="2018-04-12T11:10:00Z">
+        <w:r>
+          <w:rPr>
+            <w:rFonts w:ascii="Times" w:hAnsi="Times" w:cs="Times New Roman"/>
+            <w:sz w:val="24"/>
+            <w:szCs w:val="24"/>
+          </w:rPr>
+          <w:delText xml:space="preserve">Out </w:delText>
+        </w:r>
+      </w:del>
+      <w:ins w:id="17" w:author="Gavin McDonald" w:date="2018-04-12T11:10:00Z">
+        <w:r>
+          <w:rPr>
+            <w:rFonts w:ascii="Times" w:hAnsi="Times" w:cs="Times New Roman"/>
+            <w:sz w:val="24"/>
+            <w:szCs w:val="24"/>
+          </w:rPr>
+          <w:t>Ou</w:t>
+        </w:r>
+        <w:r>
+          <w:rPr>
+            <w:rFonts w:ascii="Times" w:hAnsi="Times" w:cs="Times New Roman"/>
+            <w:sz w:val="24"/>
+            <w:szCs w:val="24"/>
+          </w:rPr>
+          <w:t>r</w:t>
+        </w:r>
+        <w:bookmarkStart w:id="18" w:name="_GoBack"/>
+        <w:bookmarkEnd w:id="18"/>
+        <w:r>
+          <w:rPr>
+            <w:rFonts w:ascii="Times" w:hAnsi="Times" w:cs="Times New Roman"/>
+            <w:sz w:val="24"/>
+            <w:szCs w:val="24"/>
+          </w:rPr>
+          <w:t xml:space="preserve"> </w:t>
+        </w:r>
+      </w:ins>
+      <w:r>
+        <w:rPr>
+          <w:rFonts w:ascii="Times" w:hAnsi="Times" w:cs="Times New Roman"/>
+          <w:sz w:val="24"/>
+          <w:szCs w:val="24"/>
+        </w:rPr>
+        <w:t xml:space="preserve">preliminary results show highly significant effect of piracy on shipping behavior that increase both the private cost of shipping as well as the social cost of environmental pollution due to changes in transportation behavior. </w:t>
       </w:r>
     </w:p>
     <w:p>
@@ -240,7 +774,7 @@
           <w:sz w:val="24"/>
           <w:szCs w:val="24"/>
         </w:rPr>
-        <w:t>Motivation</w:t>
+        <w:t>Future steps</w:t>
       </w:r>
       <w:r>
         <w:rPr>
@@ -256,300 +790,79 @@
           <w:sz w:val="24"/>
           <w:szCs w:val="24"/>
         </w:rPr>
-        <w:t xml:space="preserve">As pointed out by Adam Smith in </w:t>
-      </w:r>
-      <w:r>
-        <w:rPr>
-          <w:rFonts w:ascii="Times" w:hAnsi="Times" w:cs="Times New Roman"/>
-          <w:sz w:val="24"/>
-          <w:szCs w:val="24"/>
-        </w:rPr>
-        <w:t xml:space="preserve">his </w:t>
-      </w:r>
-      <w:r>
-        <w:rPr>
-          <w:rFonts w:ascii="Times" w:hAnsi="Times" w:cs="Times New Roman"/>
-          <w:sz w:val="24"/>
-          <w:szCs w:val="24"/>
-        </w:rPr>
-        <w:t>foundational work The Wealth of Nations: “</w:t>
-      </w:r>
-      <w:r>
-        <w:rPr>
-          <w:rFonts w:ascii="Times" w:hAnsi="Times" w:cs="Times New Roman"/>
-          <w:sz w:val="24"/>
-          <w:szCs w:val="24"/>
-        </w:rPr>
-        <w:t>Coastal areas, and cities on rivers have been the fastest to develop, as their goods can be very cheaply transported across water versus land.</w:t>
-      </w:r>
-      <w:r>
-        <w:rPr>
-          <w:rFonts w:ascii="Times" w:hAnsi="Times" w:cs="Times New Roman"/>
-          <w:sz w:val="24"/>
-          <w:szCs w:val="24"/>
-        </w:rPr>
-        <w:t xml:space="preserve">” This statement holds true today, with most metropolitan areas worldwide located adjacent to rivers or ports, and maritime transportation remaining as one of the most cost-efficient methods for </w:t>
-      </w:r>
-      <w:r>
-        <w:rPr>
-          <w:rFonts w:ascii="Times" w:hAnsi="Times" w:cs="Times New Roman"/>
-          <w:sz w:val="24"/>
-          <w:szCs w:val="24"/>
-        </w:rPr>
-        <w:t xml:space="preserve">international </w:t>
-      </w:r>
-      <w:r>
-        <w:rPr>
-          <w:rFonts w:ascii="Times" w:hAnsi="Times" w:cs="Times New Roman"/>
-          <w:sz w:val="24"/>
-          <w:szCs w:val="24"/>
-        </w:rPr>
-        <w:t>trade. Maritime transport, however, has been historically prone to the criminal intervention</w:t>
-      </w:r>
-      <w:r>
-        <w:rPr>
-          <w:rFonts w:ascii="Times" w:hAnsi="Times" w:cs="Times New Roman"/>
-          <w:sz w:val="24"/>
-          <w:szCs w:val="24"/>
-        </w:rPr>
-        <w:t xml:space="preserve"> in the form of piracy</w:t>
-      </w:r>
-      <w:r>
-        <w:rPr>
-          <w:rFonts w:ascii="Times" w:hAnsi="Times" w:cs="Times New Roman"/>
-          <w:sz w:val="24"/>
-          <w:szCs w:val="24"/>
-        </w:rPr>
-        <w:t xml:space="preserve">. Rough assessments for the impact of modern piracy </w:t>
-      </w:r>
-      <w:r>
-        <w:rPr>
-          <w:rFonts w:ascii="Times" w:hAnsi="Times" w:cs="Times New Roman"/>
-          <w:sz w:val="24"/>
-          <w:szCs w:val="24"/>
-        </w:rPr>
-        <w:t>point to losses exceeding</w:t>
-      </w:r>
-      <w:r>
-        <w:rPr>
-          <w:rFonts w:ascii="Times" w:hAnsi="Times" w:cs="Times New Roman"/>
-          <w:sz w:val="24"/>
-          <w:szCs w:val="24"/>
-        </w:rPr>
-        <w:t xml:space="preserve"> 10 billion per year</w:t>
-      </w:r>
-      <w:r>
-        <w:rPr>
-          <w:rFonts w:ascii="Times" w:hAnsi="Times" w:cs="Times New Roman"/>
-          <w:sz w:val="24"/>
-          <w:szCs w:val="24"/>
-        </w:rPr>
-        <w:t xml:space="preserve"> worldwide</w:t>
-      </w:r>
-      <w:r>
-        <w:rPr>
-          <w:rFonts w:ascii="Times" w:hAnsi="Times" w:cs="Times New Roman"/>
-          <w:sz w:val="24"/>
-          <w:szCs w:val="24"/>
-        </w:rPr>
-        <w:t xml:space="preserve"> </w:t>
-      </w:r>
-      <w:r>
-        <w:rPr>
-          <w:rFonts w:ascii="Times" w:hAnsi="Times" w:cs="Times New Roman"/>
-          <w:sz w:val="24"/>
-          <w:szCs w:val="24"/>
-        </w:rPr>
-        <w:t>(</w:t>
-      </w:r>
-      <w:r>
-        <w:rPr>
-          <w:rFonts w:ascii="Times" w:hAnsi="Times" w:cs="Times New Roman"/>
-          <w:sz w:val="24"/>
-          <w:szCs w:val="24"/>
-        </w:rPr>
-        <w:t>Luft</w:t>
-      </w:r>
-      <w:r>
-        <w:rPr>
-          <w:rFonts w:ascii="Times" w:hAnsi="Times" w:cs="Times New Roman"/>
-          <w:sz w:val="24"/>
-          <w:szCs w:val="24"/>
-        </w:rPr>
-        <w:t xml:space="preserve"> and Corin 2004)</w:t>
-      </w:r>
-      <w:r>
-        <w:rPr>
-          <w:rFonts w:ascii="Times" w:hAnsi="Times" w:cs="Times New Roman"/>
-          <w:sz w:val="24"/>
-          <w:szCs w:val="24"/>
-        </w:rPr>
-        <w:t xml:space="preserve">, </w:t>
-      </w:r>
-      <w:r>
-        <w:rPr>
-          <w:rFonts w:ascii="Times" w:hAnsi="Times" w:cs="Times New Roman"/>
-          <w:sz w:val="24"/>
-          <w:szCs w:val="24"/>
-        </w:rPr>
-        <w:t xml:space="preserve">with most attacks taking place in the </w:t>
-      </w:r>
-      <w:r>
-        <w:rPr>
-          <w:rFonts w:ascii="Times" w:hAnsi="Times" w:cs="Times New Roman"/>
-          <w:sz w:val="24"/>
-          <w:szCs w:val="24"/>
-        </w:rPr>
-        <w:t>Straits of Malacca, West Africa, the waters off Somalia, Chittagong and the Indian Ocean.</w:t>
-      </w:r>
-      <w:r>
-        <w:rPr>
-          <w:rFonts w:ascii="Times" w:hAnsi="Times" w:cs="Times New Roman"/>
-          <w:sz w:val="24"/>
-          <w:szCs w:val="24"/>
-        </w:rPr>
-        <w:t xml:space="preserve"> </w:t>
-      </w:r>
-      <w:r>
-        <w:rPr>
-          <w:rFonts w:ascii="Times" w:hAnsi="Times" w:cs="Times New Roman"/>
-          <w:sz w:val="24"/>
-          <w:szCs w:val="24"/>
-        </w:rPr>
-        <w:t>To this date, however, t</w:t>
-      </w:r>
-      <w:r>
-        <w:rPr>
-          <w:rFonts w:ascii="Times" w:hAnsi="Times" w:cs="Times New Roman"/>
-          <w:sz w:val="24"/>
-          <w:szCs w:val="24"/>
-        </w:rPr>
-        <w:t xml:space="preserve">here is no </w:t>
-      </w:r>
-      <w:r>
-        <w:rPr>
-          <w:rFonts w:ascii="Times" w:hAnsi="Times" w:cs="Times New Roman"/>
-          <w:sz w:val="24"/>
-          <w:szCs w:val="24"/>
-        </w:rPr>
-        <w:t xml:space="preserve">unifying literature linking theoretical </w:t>
-      </w:r>
-      <w:r>
-        <w:rPr>
-          <w:rFonts w:ascii="Times" w:hAnsi="Times" w:cs="Times New Roman"/>
-          <w:sz w:val="24"/>
-          <w:szCs w:val="24"/>
-        </w:rPr>
-        <w:t>and empirical behavior of shippers and pirates to establish the causal effect of piracy on the shipping industry</w:t>
-      </w:r>
-      <w:r>
-        <w:rPr>
-          <w:rFonts w:ascii="Times" w:hAnsi="Times" w:cs="Times New Roman"/>
-          <w:sz w:val="24"/>
-          <w:szCs w:val="24"/>
-        </w:rPr>
-        <w:t>.</w:t>
-      </w:r>
-    </w:p>
-    <w:p>
-      <w:pPr>
-        <w:rPr>
-          <w:rFonts w:ascii="Times" w:hAnsi="Times" w:cs="Times New Roman"/>
-          <w:sz w:val="24"/>
-          <w:szCs w:val="24"/>
-        </w:rPr>
-      </w:pPr>
-    </w:p>
-    <w:p>
-      <w:pPr>
-        <w:rPr>
-          <w:rFonts w:ascii="Times" w:hAnsi="Times" w:cs="Times New Roman"/>
-          <w:sz w:val="24"/>
-          <w:szCs w:val="24"/>
-        </w:rPr>
-      </w:pPr>
-      <w:r>
+        <w:t>We are currently revising several sections of the paper, including an in-depth literature review</w:t>
+      </w:r>
+      <w:r>
+        <w:rPr>
+          <w:rFonts w:ascii="Times" w:hAnsi="Times" w:cs="Times New Roman"/>
+          <w:sz w:val="24"/>
+          <w:szCs w:val="24"/>
+        </w:rPr>
+        <w:t xml:space="preserve"> of both past and modern pirate activities, extension and refinement of the theoretical predictions, and an expansion of the data that supports the empirical analysis. Of particular interest at this stage of the project is the procurement of data on bunker fuel prices. Acquisition of these data will allow us to credibly control for endogeneity issues associated with captain decision when deciding on routes and cruising speed. </w:t>
+      </w:r>
+    </w:p>
+    <w:p>
+      <w:pPr>
+        <w:rPr>
+          <w:rFonts w:ascii="Times" w:hAnsi="Times" w:cs="Times New Roman"/>
+          <w:sz w:val="24"/>
+          <w:szCs w:val="24"/>
+        </w:rPr>
+      </w:pPr>
+    </w:p>
+    <w:p>
+      <w:pPr>
+        <w:rPr>
+          <w:rFonts w:ascii="Times" w:hAnsi="Times" w:cs="Times New Roman"/>
+          <w:sz w:val="24"/>
+          <w:szCs w:val="24"/>
+        </w:rPr>
+      </w:pPr>
+    </w:p>
+    <w:p>
+      <w:pPr>
+        <w:rPr>
+          <w:rFonts w:ascii="Times" w:hAnsi="Times" w:cs="Times New Roman"/>
+          <w:sz w:val="24"/>
+          <w:szCs w:val="24"/>
+        </w:rPr>
+      </w:pPr>
+    </w:p>
+    <w:p>
+      <w:pPr>
+        <w:rPr>
+          <w:rFonts w:ascii="Times" w:hAnsi="Times" w:cs="Times New Roman"/>
+          <w:sz w:val="24"/>
+          <w:szCs w:val="24"/>
+        </w:rPr>
+      </w:pPr>
+    </w:p>
+    <w:p>
+      <w:pPr>
+        <w:rPr>
+          <w:rFonts w:ascii="Times" w:hAnsi="Times" w:cs="Times New Roman"/>
+          <w:sz w:val="24"/>
+          <w:szCs w:val="24"/>
+        </w:rPr>
+      </w:pPr>
+    </w:p>
+    <w:p>
+      <w:pPr>
+        <w:rPr>
+          <w:rFonts w:ascii="Times" w:hAnsi="Times" w:cs="Times New Roman"/>
+          <w:sz w:val="24"/>
+          <w:szCs w:val="24"/>
+        </w:rPr>
+      </w:pPr>
+    </w:p>
+    <w:p>
+      <w:pPr>
         <w:rPr>
           <w:rFonts w:ascii="Times" w:hAnsi="Times" w:cs="Times New Roman"/>
           <w:b/>
           <w:sz w:val="24"/>
           <w:szCs w:val="24"/>
         </w:rPr>
-        <w:t>Results</w:t>
-      </w:r>
-      <w:r>
-        <w:rPr>
-          <w:rFonts w:ascii="Times" w:hAnsi="Times" w:cs="Times New Roman"/>
-          <w:sz w:val="24"/>
-          <w:szCs w:val="24"/>
-        </w:rPr>
-        <w:t>:</w:t>
-      </w:r>
-      <w:r>
-        <w:rPr>
-          <w:rFonts w:ascii="Times" w:hAnsi="Times" w:cs="Times New Roman"/>
-          <w:sz w:val="24"/>
-          <w:szCs w:val="24"/>
-        </w:rPr>
-        <w:t xml:space="preserve"> </w:t>
-      </w:r>
-      <w:r>
-        <w:rPr>
-          <w:rFonts w:ascii="Times" w:hAnsi="Times" w:cs="Times New Roman"/>
-          <w:sz w:val="24"/>
-          <w:szCs w:val="24"/>
-        </w:rPr>
-        <w:t xml:space="preserve">In this paper, we aim to </w:t>
-      </w:r>
-      <w:r>
-        <w:rPr>
-          <w:rFonts w:ascii="Times" w:hAnsi="Times" w:cs="Times New Roman"/>
-          <w:sz w:val="24"/>
-          <w:szCs w:val="24"/>
-        </w:rPr>
-        <w:t xml:space="preserve">unify the sparse theoretical literature with data available for both shipping routes and pirate attacks to credibly assess the causal effect of piracy on the shipping industry. To achieve this goal, we update theoretical insights to include strategic behavior across and between shippers and </w:t>
-      </w:r>
-      <w:r>
-        <w:rPr>
-          <w:rFonts w:ascii="Times" w:hAnsi="Times" w:cs="Times New Roman"/>
-          <w:sz w:val="24"/>
-          <w:szCs w:val="24"/>
-        </w:rPr>
-        <w:t>pirates and</w:t>
-      </w:r>
-      <w:r>
-        <w:rPr>
-          <w:rFonts w:ascii="Times" w:hAnsi="Times" w:cs="Times New Roman"/>
-          <w:sz w:val="24"/>
-          <w:szCs w:val="24"/>
-        </w:rPr>
-        <w:t xml:space="preserve"> collect a unique geospatial dataset </w:t>
-      </w:r>
-      <w:r>
-        <w:rPr>
-          <w:rFonts w:ascii="Times" w:hAnsi="Times" w:cs="Times New Roman"/>
-          <w:sz w:val="24"/>
-          <w:szCs w:val="24"/>
-        </w:rPr>
-        <w:t xml:space="preserve">to test those insights. Out preliminary results show highly significant effect of piracy on shipping behavior that increase both the private cost of shipping as well as the social cost of environmental pollution due to changes in transportation behavior. </w:t>
-      </w:r>
-    </w:p>
-    <w:p>
-      <w:pPr>
-        <w:rPr>
-          <w:rFonts w:ascii="Times" w:hAnsi="Times" w:cs="Times New Roman"/>
-          <w:sz w:val="24"/>
-          <w:szCs w:val="24"/>
-        </w:rPr>
-      </w:pPr>
-    </w:p>
-    <w:p>
-      <w:pPr>
-        <w:rPr>
-          <w:rFonts w:ascii="Times" w:hAnsi="Times" w:cs="Times New Roman"/>
-          <w:sz w:val="24"/>
-          <w:szCs w:val="24"/>
-        </w:rPr>
       </w:pPr>
       <w:r>
         <w:rPr>
@@ -558,106 +871,6 @@
           <w:sz w:val="24"/>
           <w:szCs w:val="24"/>
         </w:rPr>
-        <w:t>Future steps</w:t>
-      </w:r>
-      <w:r>
-        <w:rPr>
-          <w:rFonts w:ascii="Times" w:hAnsi="Times" w:cs="Times New Roman"/>
-          <w:sz w:val="24"/>
-          <w:szCs w:val="24"/>
-        </w:rPr>
-        <w:t xml:space="preserve">: </w:t>
-      </w:r>
-      <w:r>
-        <w:rPr>
-          <w:rFonts w:ascii="Times" w:hAnsi="Times" w:cs="Times New Roman"/>
-          <w:sz w:val="24"/>
-          <w:szCs w:val="24"/>
-        </w:rPr>
-        <w:t>We are currently revising several sections of the paper, including an in-depth literature review</w:t>
-      </w:r>
-      <w:r>
-        <w:rPr>
-          <w:rFonts w:ascii="Times" w:hAnsi="Times" w:cs="Times New Roman"/>
-          <w:sz w:val="24"/>
-          <w:szCs w:val="24"/>
-        </w:rPr>
-        <w:t xml:space="preserve"> of both past and modern pirate activities, extension and refinement of the theoretical predictions, and an expansion of the data that supports the empirical analysis. Of particular interest at this stage of the project is the procurement of data on bunker fuel prices. Acquisition of these data will allow us to credibly control for endogeneity issues associated with captain decision when deciding on routes and cruising speed. </w:t>
-      </w:r>
-    </w:p>
-    <w:p>
-      <w:pPr>
-        <w:rPr>
-          <w:rFonts w:ascii="Times" w:hAnsi="Times" w:cs="Times New Roman"/>
-          <w:sz w:val="24"/>
-          <w:szCs w:val="24"/>
-        </w:rPr>
-      </w:pPr>
-      <w:bookmarkStart w:id="0" w:name="_GoBack"/>
-      <w:bookmarkEnd w:id="0"/>
-    </w:p>
-    <w:p>
-      <w:pPr>
-        <w:rPr>
-          <w:rFonts w:ascii="Times" w:hAnsi="Times" w:cs="Times New Roman"/>
-          <w:sz w:val="24"/>
-          <w:szCs w:val="24"/>
-        </w:rPr>
-      </w:pPr>
-    </w:p>
-    <w:p>
-      <w:pPr>
-        <w:rPr>
-          <w:rFonts w:ascii="Times" w:hAnsi="Times" w:cs="Times New Roman"/>
-          <w:sz w:val="24"/>
-          <w:szCs w:val="24"/>
-        </w:rPr>
-      </w:pPr>
-    </w:p>
-    <w:p>
-      <w:pPr>
-        <w:rPr>
-          <w:rFonts w:ascii="Times" w:hAnsi="Times" w:cs="Times New Roman"/>
-          <w:sz w:val="24"/>
-          <w:szCs w:val="24"/>
-        </w:rPr>
-      </w:pPr>
-    </w:p>
-    <w:p>
-      <w:pPr>
-        <w:rPr>
-          <w:rFonts w:ascii="Times" w:hAnsi="Times" w:cs="Times New Roman"/>
-          <w:sz w:val="24"/>
-          <w:szCs w:val="24"/>
-        </w:rPr>
-      </w:pPr>
-    </w:p>
-    <w:p>
-      <w:pPr>
-        <w:rPr>
-          <w:rFonts w:ascii="Times" w:hAnsi="Times" w:cs="Times New Roman"/>
-          <w:sz w:val="24"/>
-          <w:szCs w:val="24"/>
-        </w:rPr>
-      </w:pPr>
-    </w:p>
-    <w:p>
-      <w:pPr>
-        <w:rPr>
-          <w:rFonts w:ascii="Times" w:hAnsi="Times" w:cs="Times New Roman"/>
-          <w:b/>
-          <w:sz w:val="24"/>
-          <w:szCs w:val="24"/>
-        </w:rPr>
-      </w:pPr>
-      <w:r>
-        <w:rPr>
-          <w:rFonts w:ascii="Times" w:hAnsi="Times" w:cs="Times New Roman"/>
-          <w:b/>
-          <w:sz w:val="24"/>
-          <w:szCs w:val="24"/>
-        </w:rPr>
-        <w:lastRenderedPageBreak/>
         <w:t>References</w:t>
       </w:r>
       <w:r>
@@ -695,7 +908,25 @@
           <w:sz w:val="20"/>
           <w:szCs w:val="20"/>
         </w:rPr>
-        <w:t>Anderson, A.G., 1979. The Business of Organized Crime: A Cosa Nostra Family. Hoover Institute Press, Stanford, CA.</w:t>
+        <w:t xml:space="preserve">Anderson, A.G., 1979. The Business of Organized Crime: A Cosa </w:t>
+      </w:r>
+      <w:proofErr w:type="gramStart"/>
+      <w:r>
+        <w:rPr>
+          <w:rFonts w:ascii="Times" w:hAnsi="Times" w:cs="Times New Roman"/>
+          <w:sz w:val="20"/>
+          <w:szCs w:val="20"/>
+        </w:rPr>
+        <w:t>Nostra</w:t>
+      </w:r>
+      <w:proofErr w:type="gramEnd"/>
+      <w:r>
+        <w:rPr>
+          <w:rFonts w:ascii="Times" w:hAnsi="Times" w:cs="Times New Roman"/>
+          <w:sz w:val="20"/>
+          <w:szCs w:val="20"/>
+        </w:rPr>
+        <w:t xml:space="preserve"> Family. Hoover Institute Press, Stanford, CA.</w:t>
       </w:r>
     </w:p>
     <w:p>
@@ -714,7 +945,25 @@
           <w:sz w:val="20"/>
           <w:szCs w:val="20"/>
         </w:rPr>
-        <w:t>Anderson, J., Marcouiller, D., 2005. Anarchy and autarchy: endogenous predation as a barrier to trade. International Economic Review 46 (1), 189–213.</w:t>
+        <w:t xml:space="preserve">Anderson, J., </w:t>
+      </w:r>
+      <w:proofErr w:type="spellStart"/>
+      <w:r>
+        <w:rPr>
+          <w:rFonts w:ascii="Times" w:hAnsi="Times" w:cs="Times New Roman"/>
+          <w:sz w:val="20"/>
+          <w:szCs w:val="20"/>
+        </w:rPr>
+        <w:t>Marcouiller</w:t>
+      </w:r>
+      <w:proofErr w:type="spellEnd"/>
+      <w:r>
+        <w:rPr>
+          <w:rFonts w:ascii="Times" w:hAnsi="Times" w:cs="Times New Roman"/>
+          <w:sz w:val="20"/>
+          <w:szCs w:val="20"/>
+        </w:rPr>
+        <w:t>, D., 2005. Anarchy and autarchy: endogenous predation as a barrier to trade. International Economic Review 46 (1), 189–213.</w:t>
       </w:r>
     </w:p>
     <w:p>
@@ -727,13 +976,23 @@
           <w:szCs w:val="20"/>
         </w:rPr>
       </w:pPr>
-      <w:r>
-        <w:rPr>
-          <w:rFonts w:ascii="Times" w:hAnsi="Times" w:cs="Times New Roman"/>
-          <w:sz w:val="20"/>
-          <w:szCs w:val="20"/>
-        </w:rPr>
-        <w:t>Arlacchi, P., 1986. Mafia Business: The Mafia Ethic and the Spirit of Capitalism. Verso, London.</w:t>
+      <w:proofErr w:type="spellStart"/>
+      <w:r>
+        <w:rPr>
+          <w:rFonts w:ascii="Times" w:hAnsi="Times" w:cs="Times New Roman"/>
+          <w:sz w:val="20"/>
+          <w:szCs w:val="20"/>
+        </w:rPr>
+        <w:t>Arlacchi</w:t>
+      </w:r>
+      <w:proofErr w:type="spellEnd"/>
+      <w:r>
+        <w:rPr>
+          <w:rFonts w:ascii="Times" w:hAnsi="Times" w:cs="Times New Roman"/>
+          <w:sz w:val="20"/>
+          <w:szCs w:val="20"/>
+        </w:rPr>
+        <w:t>, P., 1986. Mafia Business: The Mafia Ethic and the Spirit of Capitalism. Verso, London.</w:t>
       </w:r>
     </w:p>
     <w:p>
@@ -765,13 +1024,59 @@
           <w:szCs w:val="20"/>
         </w:rPr>
       </w:pPr>
-      <w:r>
-        <w:rPr>
-          <w:rFonts w:ascii="Times" w:hAnsi="Times" w:cs="Times New Roman"/>
-          <w:sz w:val="20"/>
-          <w:szCs w:val="20"/>
-        </w:rPr>
-        <w:t>Carbin, James W., 2009. Pirates: hostis humanis generis. The Federal Lawyer September 2009, 51–57.</w:t>
+      <w:proofErr w:type="spellStart"/>
+      <w:r>
+        <w:rPr>
+          <w:rFonts w:ascii="Times" w:hAnsi="Times" w:cs="Times New Roman"/>
+          <w:sz w:val="20"/>
+          <w:szCs w:val="20"/>
+        </w:rPr>
+        <w:t>Carbin</w:t>
+      </w:r>
+      <w:proofErr w:type="spellEnd"/>
+      <w:r>
+        <w:rPr>
+          <w:rFonts w:ascii="Times" w:hAnsi="Times" w:cs="Times New Roman"/>
+          <w:sz w:val="20"/>
+          <w:szCs w:val="20"/>
+        </w:rPr>
+        <w:t xml:space="preserve">, James W., 2009. Pirates: </w:t>
+      </w:r>
+      <w:proofErr w:type="spellStart"/>
+      <w:r>
+        <w:rPr>
+          <w:rFonts w:ascii="Times" w:hAnsi="Times" w:cs="Times New Roman"/>
+          <w:sz w:val="20"/>
+          <w:szCs w:val="20"/>
+        </w:rPr>
+        <w:t>hostis</w:t>
+      </w:r>
+      <w:proofErr w:type="spellEnd"/>
+      <w:r>
+        <w:rPr>
+          <w:rFonts w:ascii="Times" w:hAnsi="Times" w:cs="Times New Roman"/>
+          <w:sz w:val="20"/>
+          <w:szCs w:val="20"/>
+        </w:rPr>
+        <w:t xml:space="preserve"> </w:t>
+      </w:r>
+      <w:proofErr w:type="spellStart"/>
+      <w:r>
+        <w:rPr>
+          <w:rFonts w:ascii="Times" w:hAnsi="Times" w:cs="Times New Roman"/>
+          <w:sz w:val="20"/>
+          <w:szCs w:val="20"/>
+        </w:rPr>
+        <w:t>humanis</w:t>
+      </w:r>
+      <w:proofErr w:type="spellEnd"/>
+      <w:r>
+        <w:rPr>
+          <w:rFonts w:ascii="Times" w:hAnsi="Times" w:cs="Times New Roman"/>
+          <w:sz w:val="20"/>
+          <w:szCs w:val="20"/>
+        </w:rPr>
+        <w:t xml:space="preserve"> generis. The Federal Lawyer September 2009, 51–57.</w:t>
       </w:r>
     </w:p>
     <w:p>
@@ -822,13 +1127,23 @@
           <w:szCs w:val="20"/>
         </w:rPr>
       </w:pPr>
-      <w:r>
-        <w:rPr>
-          <w:rFonts w:ascii="Times" w:hAnsi="Times" w:cs="Times New Roman"/>
-          <w:sz w:val="20"/>
-          <w:szCs w:val="20"/>
-        </w:rPr>
-        <w:t>Garoupa, N., 2000. The economics of organized crime and optimal law enforcement. Economic Inquiry 38, 278–288.</w:t>
+      <w:proofErr w:type="spellStart"/>
+      <w:r>
+        <w:rPr>
+          <w:rFonts w:ascii="Times" w:hAnsi="Times" w:cs="Times New Roman"/>
+          <w:sz w:val="20"/>
+          <w:szCs w:val="20"/>
+        </w:rPr>
+        <w:t>Garoupa</w:t>
+      </w:r>
+      <w:proofErr w:type="spellEnd"/>
+      <w:r>
+        <w:rPr>
+          <w:rFonts w:ascii="Times" w:hAnsi="Times" w:cs="Times New Roman"/>
+          <w:sz w:val="20"/>
+          <w:szCs w:val="20"/>
+        </w:rPr>
+        <w:t>, N., 2000. The economics of organized crime and optimal law enforcement. Economic Inquiry 38, 278–288.</w:t>
       </w:r>
     </w:p>
     <w:p>
@@ -841,13 +1156,41 @@
           <w:szCs w:val="20"/>
         </w:rPr>
       </w:pPr>
-      <w:r>
-        <w:rPr>
-          <w:rFonts w:ascii="Times" w:hAnsi="Times" w:cs="Times New Roman"/>
-          <w:sz w:val="20"/>
-          <w:szCs w:val="20"/>
-        </w:rPr>
-        <w:t>Guha, B. and Guha, A.S., 2011. Pirates and traders: Some economics of pirate-infested sea</w:t>
+      <w:proofErr w:type="spellStart"/>
+      <w:r>
+        <w:rPr>
+          <w:rFonts w:ascii="Times" w:hAnsi="Times" w:cs="Times New Roman"/>
+          <w:sz w:val="20"/>
+          <w:szCs w:val="20"/>
+        </w:rPr>
+        <w:t>Guha</w:t>
+      </w:r>
+      <w:proofErr w:type="spellEnd"/>
+      <w:r>
+        <w:rPr>
+          <w:rFonts w:ascii="Times" w:hAnsi="Times" w:cs="Times New Roman"/>
+          <w:sz w:val="20"/>
+          <w:szCs w:val="20"/>
+        </w:rPr>
+        <w:t xml:space="preserve">, B. and </w:t>
+      </w:r>
+      <w:proofErr w:type="spellStart"/>
+      <w:r>
+        <w:rPr>
+          <w:rFonts w:ascii="Times" w:hAnsi="Times" w:cs="Times New Roman"/>
+          <w:sz w:val="20"/>
+          <w:szCs w:val="20"/>
+        </w:rPr>
+        <w:t>Guha</w:t>
+      </w:r>
+      <w:proofErr w:type="spellEnd"/>
+      <w:r>
+        <w:rPr>
+          <w:rFonts w:ascii="Times" w:hAnsi="Times" w:cs="Times New Roman"/>
+          <w:sz w:val="20"/>
+          <w:szCs w:val="20"/>
+        </w:rPr>
+        <w:t>, A.S., 2011. Pirates and traders: Some economics of pirate-infested sea</w:t>
       </w:r>
       <w:r>
         <w:rPr>
@@ -914,13 +1257,41 @@
           <w:szCs w:val="20"/>
         </w:rPr>
       </w:pPr>
-      <w:r>
-        <w:rPr>
-          <w:rFonts w:ascii="Times" w:hAnsi="Times" w:cs="Times New Roman"/>
-          <w:sz w:val="20"/>
-          <w:szCs w:val="20"/>
-        </w:rPr>
-        <w:t xml:space="preserve">Hallwood, P. and Miceli, T.J., 2013. An economic analysis of maritime piracy and its control. Scottish Journal </w:t>
+      <w:proofErr w:type="spellStart"/>
+      <w:r>
+        <w:rPr>
+          <w:rFonts w:ascii="Times" w:hAnsi="Times" w:cs="Times New Roman"/>
+          <w:sz w:val="20"/>
+          <w:szCs w:val="20"/>
+        </w:rPr>
+        <w:t>Hallwood</w:t>
+      </w:r>
+      <w:proofErr w:type="spellEnd"/>
+      <w:r>
+        <w:rPr>
+          <w:rFonts w:ascii="Times" w:hAnsi="Times" w:cs="Times New Roman"/>
+          <w:sz w:val="20"/>
+          <w:szCs w:val="20"/>
+        </w:rPr>
+        <w:t xml:space="preserve">, P. and </w:t>
+      </w:r>
+      <w:proofErr w:type="spellStart"/>
+      <w:r>
+        <w:rPr>
+          <w:rFonts w:ascii="Times" w:hAnsi="Times" w:cs="Times New Roman"/>
+          <w:sz w:val="20"/>
+          <w:szCs w:val="20"/>
+        </w:rPr>
+        <w:t>Miceli</w:t>
+      </w:r>
+      <w:proofErr w:type="spellEnd"/>
+      <w:r>
+        <w:rPr>
+          <w:rFonts w:ascii="Times" w:hAnsi="Times" w:cs="Times New Roman"/>
+          <w:sz w:val="20"/>
+          <w:szCs w:val="20"/>
+        </w:rPr>
+        <w:t xml:space="preserve">, T.J., 2013. An economic analysis of maritime piracy and its control. Scottish Journal </w:t>
       </w:r>
       <w:r>
         <w:rPr>
@@ -974,7 +1345,43 @@
           <w:sz w:val="20"/>
           <w:szCs w:val="20"/>
         </w:rPr>
-        <w:t>Konrad, K., Skaperdas, S., 1998. Extortion. Economica 65, 461–477.</w:t>
+        <w:t xml:space="preserve">Konrad, K., </w:t>
+      </w:r>
+      <w:proofErr w:type="spellStart"/>
+      <w:r>
+        <w:rPr>
+          <w:rFonts w:ascii="Times" w:hAnsi="Times" w:cs="Times New Roman"/>
+          <w:sz w:val="20"/>
+          <w:szCs w:val="20"/>
+        </w:rPr>
+        <w:t>Skaperdas</w:t>
+      </w:r>
+      <w:proofErr w:type="spellEnd"/>
+      <w:r>
+        <w:rPr>
+          <w:rFonts w:ascii="Times" w:hAnsi="Times" w:cs="Times New Roman"/>
+          <w:sz w:val="20"/>
+          <w:szCs w:val="20"/>
+        </w:rPr>
+        <w:t xml:space="preserve">, S., 1998. Extortion. </w:t>
+      </w:r>
+      <w:proofErr w:type="spellStart"/>
+      <w:r>
+        <w:rPr>
+          <w:rFonts w:ascii="Times" w:hAnsi="Times" w:cs="Times New Roman"/>
+          <w:sz w:val="20"/>
+          <w:szCs w:val="20"/>
+        </w:rPr>
+        <w:t>Economica</w:t>
+      </w:r>
+      <w:proofErr w:type="spellEnd"/>
+      <w:r>
+        <w:rPr>
+          <w:rFonts w:ascii="Times" w:hAnsi="Times" w:cs="Times New Roman"/>
+          <w:sz w:val="20"/>
+          <w:szCs w:val="20"/>
+        </w:rPr>
+        <w:t xml:space="preserve"> 65, 461–477.</w:t>
       </w:r>
     </w:p>
     <w:p>
@@ -987,13 +1394,23 @@
           <w:szCs w:val="20"/>
         </w:rPr>
       </w:pPr>
-      <w:r>
-        <w:rPr>
-          <w:rFonts w:ascii="Times" w:hAnsi="Times" w:cs="Times New Roman"/>
-          <w:sz w:val="20"/>
-          <w:szCs w:val="20"/>
-        </w:rPr>
-        <w:t>Kraska, J., Wilson, B., 2008. Combating the pirates of the Gulf of Aden: collaboration, not</w:t>
+      <w:proofErr w:type="spellStart"/>
+      <w:r>
+        <w:rPr>
+          <w:rFonts w:ascii="Times" w:hAnsi="Times" w:cs="Times New Roman"/>
+          <w:sz w:val="20"/>
+          <w:szCs w:val="20"/>
+        </w:rPr>
+        <w:t>Kraska</w:t>
+      </w:r>
+      <w:proofErr w:type="spellEnd"/>
+      <w:r>
+        <w:rPr>
+          <w:rFonts w:ascii="Times" w:hAnsi="Times" w:cs="Times New Roman"/>
+          <w:sz w:val="20"/>
+          <w:szCs w:val="20"/>
+        </w:rPr>
+        <w:t>, J., Wilson, B., 2008. Combating the pirates of the Gulf of Aden: collaboration, not</w:t>
       </w:r>
       <w:r>
         <w:rPr>
@@ -1028,7 +1445,43 @@
           <w:sz w:val="20"/>
           <w:szCs w:val="20"/>
         </w:rPr>
-        <w:t>Leeson, P., 2007. An-arrgh-chy: the law and economics of pirate organization. Journal of</w:t>
+        <w:t>Leeson, P., 2007. An-</w:t>
+      </w:r>
+      <w:proofErr w:type="spellStart"/>
+      <w:r>
+        <w:rPr>
+          <w:rFonts w:ascii="Times" w:hAnsi="Times" w:cs="Times New Roman"/>
+          <w:sz w:val="20"/>
+          <w:szCs w:val="20"/>
+        </w:rPr>
+        <w:t>arrgh</w:t>
+      </w:r>
+      <w:proofErr w:type="spellEnd"/>
+      <w:r>
+        <w:rPr>
+          <w:rFonts w:ascii="Times" w:hAnsi="Times" w:cs="Times New Roman"/>
+          <w:sz w:val="20"/>
+          <w:szCs w:val="20"/>
+        </w:rPr>
+        <w:t>-</w:t>
+      </w:r>
+      <w:proofErr w:type="spellStart"/>
+      <w:r>
+        <w:rPr>
+          <w:rFonts w:ascii="Times" w:hAnsi="Times" w:cs="Times New Roman"/>
+          <w:sz w:val="20"/>
+          <w:szCs w:val="20"/>
+        </w:rPr>
+        <w:t>chy</w:t>
+      </w:r>
+      <w:proofErr w:type="spellEnd"/>
+      <w:r>
+        <w:rPr>
+          <w:rFonts w:ascii="Times" w:hAnsi="Times" w:cs="Times New Roman"/>
+          <w:sz w:val="20"/>
+          <w:szCs w:val="20"/>
+        </w:rPr>
+        <w:t>: the law and economics of pirate organization. Journal of</w:t>
       </w:r>
       <w:r>
         <w:rPr>
@@ -1219,7 +1672,25 @@
           <w:sz w:val="20"/>
           <w:szCs w:val="20"/>
         </w:rPr>
-        <w:t>Leeson, P.T., 2010b. Pirational choice: the economics of infamous pirate practices. Journal of Economic Behavior &amp; Organization, 76(3), pp.497-510.</w:t>
+        <w:t xml:space="preserve">Leeson, P.T., 2010b. </w:t>
+      </w:r>
+      <w:proofErr w:type="spellStart"/>
+      <w:r>
+        <w:rPr>
+          <w:rFonts w:ascii="Times" w:hAnsi="Times" w:cs="Times New Roman"/>
+          <w:sz w:val="20"/>
+          <w:szCs w:val="20"/>
+        </w:rPr>
+        <w:t>Pirational</w:t>
+      </w:r>
+      <w:proofErr w:type="spellEnd"/>
+      <w:r>
+        <w:rPr>
+          <w:rFonts w:ascii="Times" w:hAnsi="Times" w:cs="Times New Roman"/>
+          <w:sz w:val="20"/>
+          <w:szCs w:val="20"/>
+        </w:rPr>
+        <w:t xml:space="preserve"> choice: the economics of infamous pirate practices. Journal of Economic Behavior &amp; Organization, 76(3), pp.497-510.</w:t>
       </w:r>
     </w:p>
     <w:p>
@@ -1353,13 +1824,23 @@
         </w:rPr>
         <w:t xml:space="preserve"> </w:t>
       </w:r>
-      <w:r>
-        <w:rPr>
-          <w:rFonts w:ascii="Times" w:hAnsi="Times" w:cs="Times New Roman"/>
-          <w:sz w:val="20"/>
-          <w:szCs w:val="20"/>
-        </w:rPr>
-        <w:t>Ellmann, B., Forbes, A., Rosenberg, D. (Eds.), Piracy and Maritime Crime: Historical</w:t>
+      <w:proofErr w:type="spellStart"/>
+      <w:r>
+        <w:rPr>
+          <w:rFonts w:ascii="Times" w:hAnsi="Times" w:cs="Times New Roman"/>
+          <w:sz w:val="20"/>
+          <w:szCs w:val="20"/>
+        </w:rPr>
+        <w:t>Ellmann</w:t>
+      </w:r>
+      <w:proofErr w:type="spellEnd"/>
+      <w:r>
+        <w:rPr>
+          <w:rFonts w:ascii="Times" w:hAnsi="Times" w:cs="Times New Roman"/>
+          <w:sz w:val="20"/>
+          <w:szCs w:val="20"/>
+        </w:rPr>
+        <w:t>, B., Forbes, A., Rosenberg, D. (Eds.), Piracy and Maritime Crime: Historical</w:t>
       </w:r>
       <w:r>
         <w:rPr>
@@ -1423,13 +1904,23 @@
           <w:szCs w:val="20"/>
         </w:rPr>
       </w:pPr>
-      <w:r>
-        <w:rPr>
-          <w:rFonts w:ascii="Times" w:hAnsi="Times" w:cs="Times New Roman"/>
-          <w:sz w:val="20"/>
-          <w:szCs w:val="20"/>
-        </w:rPr>
-        <w:t>Skaperdas, S., 2001. The political economy of organized crime: providing protection</w:t>
+      <w:proofErr w:type="spellStart"/>
+      <w:r>
+        <w:rPr>
+          <w:rFonts w:ascii="Times" w:hAnsi="Times" w:cs="Times New Roman"/>
+          <w:sz w:val="20"/>
+          <w:szCs w:val="20"/>
+        </w:rPr>
+        <w:t>Skaperdas</w:t>
+      </w:r>
+      <w:proofErr w:type="spellEnd"/>
+      <w:r>
+        <w:rPr>
+          <w:rFonts w:ascii="Times" w:hAnsi="Times" w:cs="Times New Roman"/>
+          <w:sz w:val="20"/>
+          <w:szCs w:val="20"/>
+        </w:rPr>
+        <w:t>, S., 2001. The political economy of organized crime: providing protection</w:t>
       </w:r>
       <w:r>
         <w:rPr>
@@ -1465,7 +1956,7 @@
 </file>
 
 <file path=word/endnotes.xml><?xml version="1.0" encoding="utf-8"?>
-<w:endnotes xmlns:wpc="http://schemas.microsoft.com/office/word/2010/wordprocessingCanvas" xmlns:cx="http://schemas.microsoft.com/office/drawing/2014/chartex" xmlns:cx1="http://schemas.microsoft.com/office/drawing/2015/9/8/chartex" xmlns:cx2="http://schemas.microsoft.com/office/drawing/2015/10/21/chartex" xmlns:cx3="http://schemas.microsoft.com/office/drawing/2016/5/9/chartex" xmlns:cx4="http://schemas.microsoft.com/office/drawing/2016/5/10/chartex" xmlns:cx5="http://schemas.microsoft.com/office/drawing/2016/5/11/chartex" xmlns:cx6="http://schemas.microsoft.com/office/drawing/2016/5/12/chartex" xmlns:cx7="http://schemas.microsoft.com/office/drawing/2016/5/13/chartex" xmlns:cx8="http://schemas.microsoft.com/office/drawing/2016/5/14/chartex" xmlns:mc="http://schemas.openxmlformats.org/markup-compatibility/2006" xmlns:aink="http://schemas.microsoft.com/office/drawing/2016/ink" xmlns:am3d="http://schemas.microsoft.com/office/drawing/2017/model3d" xmlns:o="urn:schemas-microsoft-com:office:office" xmlns:r="http://schemas.openxmlformats.org/officeDocument/2006/relationships" xmlns:m="http://schemas.openxmlformats.org/officeDocument/2006/math" xmlns:v="urn:schemas-microsoft-com:vml" xmlns:wp14="http://schemas.microsoft.com/office/word/2010/wordprocessingDrawing" xmlns:wp="http://schemas.openxmlformats.org/drawingml/2006/wordprocessingDrawing" xmlns:w10="urn:schemas-microsoft-com:office:word" xmlns:w="http://schemas.openxmlformats.org/wordprocessingml/2006/main" xmlns:w14="http://schemas.microsoft.com/office/word/2010/wordml" xmlns:w15="http://schemas.microsoft.com/office/word/2012/wordml" xmlns:w16cid="http://schemas.microsoft.com/office/word/2016/wordml/cid" xmlns:w16se="http://schemas.microsoft.com/office/word/2015/wordml/symex" xmlns:wpg="http://schemas.microsoft.com/office/word/2010/wordprocessingGroup" xmlns:wpi="http://schemas.microsoft.com/office/word/2010/wordprocessingInk" xmlns:wne="http://schemas.microsoft.com/office/word/2006/wordml" xmlns:wps="http://schemas.microsoft.com/office/word/2010/wordprocessingShape" mc:Ignorable="w14 w15 w16se w16cid wp14">
+<w:endnotes xmlns:wpc="http://schemas.microsoft.com/office/word/2010/wordprocessingCanvas" xmlns:mo="http://schemas.microsoft.com/office/mac/office/2008/main" xmlns:mc="http://schemas.openxmlformats.org/markup-compatibility/2006" xmlns:mv="urn:schemas-microsoft-com:mac:vml" xmlns:o="urn:schemas-microsoft-com:office:office" xmlns:r="http://schemas.openxmlformats.org/officeDocument/2006/relationships" xmlns:m="http://schemas.openxmlformats.org/officeDocument/2006/math" xmlns:v="urn:schemas-microsoft-com:vml" xmlns:wp14="http://schemas.microsoft.com/office/word/2010/wordprocessingDrawing" xmlns:wp="http://schemas.openxmlformats.org/drawingml/2006/wordprocessingDrawing" xmlns:w10="urn:schemas-microsoft-com:office:word" xmlns:w="http://schemas.openxmlformats.org/wordprocessingml/2006/main" xmlns:w14="http://schemas.microsoft.com/office/word/2010/wordml" xmlns:w15="http://schemas.microsoft.com/office/word/2012/wordml" xmlns:wpg="http://schemas.microsoft.com/office/word/2010/wordprocessingGroup" xmlns:wpi="http://schemas.microsoft.com/office/word/2010/wordprocessingInk" xmlns:wne="http://schemas.microsoft.com/office/word/2006/wordml" xmlns:wps="http://schemas.microsoft.com/office/word/2010/wordprocessingShape" mc:Ignorable="w14 w15 wp14">
   <w:endnote w:type="separator" w:id="-1">
     <w:p>
       <w:pPr>
@@ -1490,7 +1981,7 @@
 </file>
 
 <file path=word/footer1.xml><?xml version="1.0" encoding="utf-8"?>
-<w:ftr xmlns:wpc="http://schemas.microsoft.com/office/word/2010/wordprocessingCanvas" xmlns:cx="http://schemas.microsoft.com/office/drawing/2014/chartex" xmlns:cx1="http://schemas.microsoft.com/office/drawing/2015/9/8/chartex" xmlns:cx2="http://schemas.microsoft.com/office/drawing/2015/10/21/chartex" xmlns:cx3="http://schemas.microsoft.com/office/drawing/2016/5/9/chartex" xmlns:cx4="http://schemas.microsoft.com/office/drawing/2016/5/10/chartex" xmlns:cx5="http://schemas.microsoft.com/office/drawing/2016/5/11/chartex" xmlns:cx6="http://schemas.microsoft.com/office/drawing/2016/5/12/chartex" xmlns:cx7="http://schemas.microsoft.com/office/drawing/2016/5/13/chartex" xmlns:cx8="http://schemas.microsoft.com/office/drawing/2016/5/14/chartex" xmlns:mc="http://schemas.openxmlformats.org/markup-compatibility/2006" xmlns:aink="http://schemas.microsoft.com/office/drawing/2016/ink" xmlns:am3d="http://schemas.microsoft.com/office/drawing/2017/model3d" xmlns:o="urn:schemas-microsoft-com:office:office" xmlns:r="http://schemas.openxmlformats.org/officeDocument/2006/relationships" xmlns:m="http://schemas.openxmlformats.org/officeDocument/2006/math" xmlns:v="urn:schemas-microsoft-com:vml" xmlns:wp14="http://schemas.microsoft.com/office/word/2010/wordprocessingDrawing" xmlns:wp="http://schemas.openxmlformats.org/drawingml/2006/wordprocessingDrawing" xmlns:w10="urn:schemas-microsoft-com:office:word" xmlns:w="http://schemas.openxmlformats.org/wordprocessingml/2006/main" xmlns:w14="http://schemas.microsoft.com/office/word/2010/wordml" xmlns:w15="http://schemas.microsoft.com/office/word/2012/wordml" xmlns:w16cid="http://schemas.microsoft.com/office/word/2016/wordml/cid" xmlns:w16se="http://schemas.microsoft.com/office/word/2015/wordml/symex" xmlns:wpg="http://schemas.microsoft.com/office/word/2010/wordprocessingGroup" xmlns:wpi="http://schemas.microsoft.com/office/word/2010/wordprocessingInk" xmlns:wne="http://schemas.microsoft.com/office/word/2006/wordml" xmlns:wps="http://schemas.microsoft.com/office/word/2010/wordprocessingShape" mc:Ignorable="w14 w15 w16se w16cid wp14">
+<w:ftr xmlns:wpc="http://schemas.microsoft.com/office/word/2010/wordprocessingCanvas" xmlns:mo="http://schemas.microsoft.com/office/mac/office/2008/main" xmlns:mc="http://schemas.openxmlformats.org/markup-compatibility/2006" xmlns:mv="urn:schemas-microsoft-com:mac:vml" xmlns:o="urn:schemas-microsoft-com:office:office" xmlns:r="http://schemas.openxmlformats.org/officeDocument/2006/relationships" xmlns:m="http://schemas.openxmlformats.org/officeDocument/2006/math" xmlns:v="urn:schemas-microsoft-com:vml" xmlns:wp14="http://schemas.microsoft.com/office/word/2010/wordprocessingDrawing" xmlns:wp="http://schemas.openxmlformats.org/drawingml/2006/wordprocessingDrawing" xmlns:w10="urn:schemas-microsoft-com:office:word" xmlns:w="http://schemas.openxmlformats.org/wordprocessingml/2006/main" xmlns:w14="http://schemas.microsoft.com/office/word/2010/wordml" xmlns:w15="http://schemas.microsoft.com/office/word/2012/wordml" xmlns:wpg="http://schemas.microsoft.com/office/word/2010/wordprocessingGroup" xmlns:wpi="http://schemas.microsoft.com/office/word/2010/wordprocessingInk" xmlns:wne="http://schemas.microsoft.com/office/word/2006/wordml" xmlns:wps="http://schemas.microsoft.com/office/word/2010/wordprocessingShape" mc:Ignorable="w14 w15 wp14">
   <w:p>
     <w:pPr>
       <w:pStyle w:val="Footer"/>
@@ -1500,7 +1991,7 @@
 </file>
 
 <file path=word/footer2.xml><?xml version="1.0" encoding="utf-8"?>
-<w:ftr xmlns:wpc="http://schemas.microsoft.com/office/word/2010/wordprocessingCanvas" xmlns:cx="http://schemas.microsoft.com/office/drawing/2014/chartex" xmlns:cx1="http://schemas.microsoft.com/office/drawing/2015/9/8/chartex" xmlns:cx2="http://schemas.microsoft.com/office/drawing/2015/10/21/chartex" xmlns:cx3="http://schemas.microsoft.com/office/drawing/2016/5/9/chartex" xmlns:cx4="http://schemas.microsoft.com/office/drawing/2016/5/10/chartex" xmlns:cx5="http://schemas.microsoft.com/office/drawing/2016/5/11/chartex" xmlns:cx6="http://schemas.microsoft.com/office/drawing/2016/5/12/chartex" xmlns:cx7="http://schemas.microsoft.com/office/drawing/2016/5/13/chartex" xmlns:cx8="http://schemas.microsoft.com/office/drawing/2016/5/14/chartex" xmlns:mc="http://schemas.openxmlformats.org/markup-compatibility/2006" xmlns:aink="http://schemas.microsoft.com/office/drawing/2016/ink" xmlns:am3d="http://schemas.microsoft.com/office/drawing/2017/model3d" xmlns:o="urn:schemas-microsoft-com:office:office" xmlns:r="http://schemas.openxmlformats.org/officeDocument/2006/relationships" xmlns:m="http://schemas.openxmlformats.org/officeDocument/2006/math" xmlns:v="urn:schemas-microsoft-com:vml" xmlns:wp14="http://schemas.microsoft.com/office/word/2010/wordprocessingDrawing" xmlns:wp="http://schemas.openxmlformats.org/drawingml/2006/wordprocessingDrawing" xmlns:w10="urn:schemas-microsoft-com:office:word" xmlns:w="http://schemas.openxmlformats.org/wordprocessingml/2006/main" xmlns:w14="http://schemas.microsoft.com/office/word/2010/wordml" xmlns:w15="http://schemas.microsoft.com/office/word/2012/wordml" xmlns:w16cid="http://schemas.microsoft.com/office/word/2016/wordml/cid" xmlns:w16se="http://schemas.microsoft.com/office/word/2015/wordml/symex" xmlns:wpg="http://schemas.microsoft.com/office/word/2010/wordprocessingGroup" xmlns:wpi="http://schemas.microsoft.com/office/word/2010/wordprocessingInk" xmlns:wne="http://schemas.microsoft.com/office/word/2006/wordml" xmlns:wps="http://schemas.microsoft.com/office/word/2010/wordprocessingShape" mc:Ignorable="w14 w15 w16se w16cid wp14">
+<w:ftr xmlns:wpc="http://schemas.microsoft.com/office/word/2010/wordprocessingCanvas" xmlns:mo="http://schemas.microsoft.com/office/mac/office/2008/main" xmlns:mc="http://schemas.openxmlformats.org/markup-compatibility/2006" xmlns:mv="urn:schemas-microsoft-com:mac:vml" xmlns:o="urn:schemas-microsoft-com:office:office" xmlns:r="http://schemas.openxmlformats.org/officeDocument/2006/relationships" xmlns:m="http://schemas.openxmlformats.org/officeDocument/2006/math" xmlns:v="urn:schemas-microsoft-com:vml" xmlns:wp14="http://schemas.microsoft.com/office/word/2010/wordprocessingDrawing" xmlns:wp="http://schemas.openxmlformats.org/drawingml/2006/wordprocessingDrawing" xmlns:w10="urn:schemas-microsoft-com:office:word" xmlns:w="http://schemas.openxmlformats.org/wordprocessingml/2006/main" xmlns:w14="http://schemas.microsoft.com/office/word/2010/wordml" xmlns:w15="http://schemas.microsoft.com/office/word/2012/wordml" xmlns:wpg="http://schemas.microsoft.com/office/word/2010/wordprocessingGroup" xmlns:wpi="http://schemas.microsoft.com/office/word/2010/wordprocessingInk" xmlns:wne="http://schemas.microsoft.com/office/word/2006/wordml" xmlns:wps="http://schemas.microsoft.com/office/word/2010/wordprocessingShape" mc:Ignorable="w14 w15 wp14">
   <w:p>
     <w:pPr>
       <w:pStyle w:val="Footer"/>
@@ -1510,7 +2001,7 @@
 </file>
 
 <file path=word/footer3.xml><?xml version="1.0" encoding="utf-8"?>
-<w:ftr xmlns:wpc="http://schemas.microsoft.com/office/word/2010/wordprocessingCanvas" xmlns:cx="http://schemas.microsoft.com/office/drawing/2014/chartex" xmlns:cx1="http://schemas.microsoft.com/office/drawing/2015/9/8/chartex" xmlns:cx2="http://schemas.microsoft.com/office/drawing/2015/10/21/chartex" xmlns:cx3="http://schemas.microsoft.com/office/drawing/2016/5/9/chartex" xmlns:cx4="http://schemas.microsoft.com/office/drawing/2016/5/10/chartex" xmlns:cx5="http://schemas.microsoft.com/office/drawing/2016/5/11/chartex" xmlns:cx6="http://schemas.microsoft.com/office/drawing/2016/5/12/chartex" xmlns:cx7="http://schemas.microsoft.com/office/drawing/2016/5/13/chartex" xmlns:cx8="http://schemas.microsoft.com/office/drawing/2016/5/14/chartex" xmlns:mc="http://schemas.openxmlformats.org/markup-compatibility/2006" xmlns:aink="http://schemas.microsoft.com/office/drawing/2016/ink" xmlns:am3d="http://schemas.microsoft.com/office/drawing/2017/model3d" xmlns:o="urn:schemas-microsoft-com:office:office" xmlns:r="http://schemas.openxmlformats.org/officeDocument/2006/relationships" xmlns:m="http://schemas.openxmlformats.org/officeDocument/2006/math" xmlns:v="urn:schemas-microsoft-com:vml" xmlns:wp14="http://schemas.microsoft.com/office/word/2010/wordprocessingDrawing" xmlns:wp="http://schemas.openxmlformats.org/drawingml/2006/wordprocessingDrawing" xmlns:w10="urn:schemas-microsoft-com:office:word" xmlns:w="http://schemas.openxmlformats.org/wordprocessingml/2006/main" xmlns:w14="http://schemas.microsoft.com/office/word/2010/wordml" xmlns:w15="http://schemas.microsoft.com/office/word/2012/wordml" xmlns:w16cid="http://schemas.microsoft.com/office/word/2016/wordml/cid" xmlns:w16se="http://schemas.microsoft.com/office/word/2015/wordml/symex" xmlns:wpg="http://schemas.microsoft.com/office/word/2010/wordprocessingGroup" xmlns:wpi="http://schemas.microsoft.com/office/word/2010/wordprocessingInk" xmlns:wne="http://schemas.microsoft.com/office/word/2006/wordml" xmlns:wps="http://schemas.microsoft.com/office/word/2010/wordprocessingShape" mc:Ignorable="w14 w15 w16se w16cid wp14">
+<w:ftr xmlns:wpc="http://schemas.microsoft.com/office/word/2010/wordprocessingCanvas" xmlns:mo="http://schemas.microsoft.com/office/mac/office/2008/main" xmlns:mc="http://schemas.openxmlformats.org/markup-compatibility/2006" xmlns:mv="urn:schemas-microsoft-com:mac:vml" xmlns:o="urn:schemas-microsoft-com:office:office" xmlns:r="http://schemas.openxmlformats.org/officeDocument/2006/relationships" xmlns:m="http://schemas.openxmlformats.org/officeDocument/2006/math" xmlns:v="urn:schemas-microsoft-com:vml" xmlns:wp14="http://schemas.microsoft.com/office/word/2010/wordprocessingDrawing" xmlns:wp="http://schemas.openxmlformats.org/drawingml/2006/wordprocessingDrawing" xmlns:w10="urn:schemas-microsoft-com:office:word" xmlns:w="http://schemas.openxmlformats.org/wordprocessingml/2006/main" xmlns:w14="http://schemas.microsoft.com/office/word/2010/wordml" xmlns:w15="http://schemas.microsoft.com/office/word/2012/wordml" xmlns:wpg="http://schemas.microsoft.com/office/word/2010/wordprocessingGroup" xmlns:wpi="http://schemas.microsoft.com/office/word/2010/wordprocessingInk" xmlns:wne="http://schemas.microsoft.com/office/word/2006/wordml" xmlns:wps="http://schemas.microsoft.com/office/word/2010/wordprocessingShape" mc:Ignorable="w14 w15 wp14">
   <w:p>
     <w:pPr>
       <w:pStyle w:val="Footer"/>
@@ -1520,7 +2011,7 @@
 </file>
 
 <file path=word/footnotes.xml><?xml version="1.0" encoding="utf-8"?>
-<w:footnotes xmlns:wpc="http://schemas.microsoft.com/office/word/2010/wordprocessingCanvas" xmlns:cx="http://schemas.microsoft.com/office/drawing/2014/chartex" xmlns:cx1="http://schemas.microsoft.com/office/drawing/2015/9/8/chartex" xmlns:cx2="http://schemas.microsoft.com/office/drawing/2015/10/21/chartex" xmlns:cx3="http://schemas.microsoft.com/office/drawing/2016/5/9/chartex" xmlns:cx4="http://schemas.microsoft.com/office/drawing/2016/5/10/chartex" xmlns:cx5="http://schemas.microsoft.com/office/drawing/2016/5/11/chartex" xmlns:cx6="http://schemas.microsoft.com/office/drawing/2016/5/12/chartex" xmlns:cx7="http://schemas.microsoft.com/office/drawing/2016/5/13/chartex" xmlns:cx8="http://schemas.microsoft.com/office/drawing/2016/5/14/chartex" xmlns:mc="http://schemas.openxmlformats.org/markup-compatibility/2006" xmlns:aink="http://schemas.microsoft.com/office/drawing/2016/ink" xmlns:am3d="http://schemas.microsoft.com/office/drawing/2017/model3d" xmlns:o="urn:schemas-microsoft-com:office:office" xmlns:r="http://schemas.openxmlformats.org/officeDocument/2006/relationships" xmlns:m="http://schemas.openxmlformats.org/officeDocument/2006/math" xmlns:v="urn:schemas-microsoft-com:vml" xmlns:wp14="http://schemas.microsoft.com/office/word/2010/wordprocessingDrawing" xmlns:wp="http://schemas.openxmlformats.org/drawingml/2006/wordprocessingDrawing" xmlns:w10="urn:schemas-microsoft-com:office:word" xmlns:w="http://schemas.openxmlformats.org/wordprocessingml/2006/main" xmlns:w14="http://schemas.microsoft.com/office/word/2010/wordml" xmlns:w15="http://schemas.microsoft.com/office/word/2012/wordml" xmlns:w16cid="http://schemas.microsoft.com/office/word/2016/wordml/cid" xmlns:w16se="http://schemas.microsoft.com/office/word/2015/wordml/symex" xmlns:wpg="http://schemas.microsoft.com/office/word/2010/wordprocessingGroup" xmlns:wpi="http://schemas.microsoft.com/office/word/2010/wordprocessingInk" xmlns:wne="http://schemas.microsoft.com/office/word/2006/wordml" xmlns:wps="http://schemas.microsoft.com/office/word/2010/wordprocessingShape" mc:Ignorable="w14 w15 w16se w16cid wp14">
+<w:footnotes xmlns:wpc="http://schemas.microsoft.com/office/word/2010/wordprocessingCanvas" xmlns:mo="http://schemas.microsoft.com/office/mac/office/2008/main" xmlns:mc="http://schemas.openxmlformats.org/markup-compatibility/2006" xmlns:mv="urn:schemas-microsoft-com:mac:vml" xmlns:o="urn:schemas-microsoft-com:office:office" xmlns:r="http://schemas.openxmlformats.org/officeDocument/2006/relationships" xmlns:m="http://schemas.openxmlformats.org/officeDocument/2006/math" xmlns:v="urn:schemas-microsoft-com:vml" xmlns:wp14="http://schemas.microsoft.com/office/word/2010/wordprocessingDrawing" xmlns:wp="http://schemas.openxmlformats.org/drawingml/2006/wordprocessingDrawing" xmlns:w10="urn:schemas-microsoft-com:office:word" xmlns:w="http://schemas.openxmlformats.org/wordprocessingml/2006/main" xmlns:w14="http://schemas.microsoft.com/office/word/2010/wordml" xmlns:w15="http://schemas.microsoft.com/office/word/2012/wordml" xmlns:wpg="http://schemas.microsoft.com/office/word/2010/wordprocessingGroup" xmlns:wpi="http://schemas.microsoft.com/office/word/2010/wordprocessingInk" xmlns:wne="http://schemas.microsoft.com/office/word/2006/wordml" xmlns:wps="http://schemas.microsoft.com/office/word/2010/wordprocessingShape" mc:Ignorable="w14 w15 wp14">
   <w:footnote w:type="separator" w:id="-1">
     <w:p>
       <w:pPr>
@@ -1545,7 +2036,7 @@
 </file>
 
 <file path=word/header1.xml><?xml version="1.0" encoding="utf-8"?>
-<w:hdr xmlns:wpc="http://schemas.microsoft.com/office/word/2010/wordprocessingCanvas" xmlns:cx="http://schemas.microsoft.com/office/drawing/2014/chartex" xmlns:cx1="http://schemas.microsoft.com/office/drawing/2015/9/8/chartex" xmlns:cx2="http://schemas.microsoft.com/office/drawing/2015/10/21/chartex" xmlns:cx3="http://schemas.microsoft.com/office/drawing/2016/5/9/chartex" xmlns:cx4="http://schemas.microsoft.com/office/drawing/2016/5/10/chartex" xmlns:cx5="http://schemas.microsoft.com/office/drawing/2016/5/11/chartex" xmlns:cx6="http://schemas.microsoft.com/office/drawing/2016/5/12/chartex" xmlns:cx7="http://schemas.microsoft.com/office/drawing/2016/5/13/chartex" xmlns:cx8="http://schemas.microsoft.com/office/drawing/2016/5/14/chartex" xmlns:mc="http://schemas.openxmlformats.org/markup-compatibility/2006" xmlns:aink="http://schemas.microsoft.com/office/drawing/2016/ink" xmlns:am3d="http://schemas.microsoft.com/office/drawing/2017/model3d" xmlns:o="urn:schemas-microsoft-com:office:office" xmlns:r="http://schemas.openxmlformats.org/officeDocument/2006/relationships" xmlns:m="http://schemas.openxmlformats.org/officeDocument/2006/math" xmlns:v="urn:schemas-microsoft-com:vml" xmlns:wp14="http://schemas.microsoft.com/office/word/2010/wordprocessingDrawing" xmlns:wp="http://schemas.openxmlformats.org/drawingml/2006/wordprocessingDrawing" xmlns:w10="urn:schemas-microsoft-com:office:word" xmlns:w="http://schemas.openxmlformats.org/wordprocessingml/2006/main" xmlns:w14="http://schemas.microsoft.com/office/word/2010/wordml" xmlns:w15="http://schemas.microsoft.com/office/word/2012/wordml" xmlns:w16cid="http://schemas.microsoft.com/office/word/2016/wordml/cid" xmlns:w16se="http://schemas.microsoft.com/office/word/2015/wordml/symex" xmlns:wpg="http://schemas.microsoft.com/office/word/2010/wordprocessingGroup" xmlns:wpi="http://schemas.microsoft.com/office/word/2010/wordprocessingInk" xmlns:wne="http://schemas.microsoft.com/office/word/2006/wordml" xmlns:wps="http://schemas.microsoft.com/office/word/2010/wordprocessingShape" mc:Ignorable="w14 w15 w16se w16cid wp14">
+<w:hdr xmlns:wpc="http://schemas.microsoft.com/office/word/2010/wordprocessingCanvas" xmlns:mo="http://schemas.microsoft.com/office/mac/office/2008/main" xmlns:mc="http://schemas.openxmlformats.org/markup-compatibility/2006" xmlns:mv="urn:schemas-microsoft-com:mac:vml" xmlns:o="urn:schemas-microsoft-com:office:office" xmlns:r="http://schemas.openxmlformats.org/officeDocument/2006/relationships" xmlns:m="http://schemas.openxmlformats.org/officeDocument/2006/math" xmlns:v="urn:schemas-microsoft-com:vml" xmlns:wp14="http://schemas.microsoft.com/office/word/2010/wordprocessingDrawing" xmlns:wp="http://schemas.openxmlformats.org/drawingml/2006/wordprocessingDrawing" xmlns:w10="urn:schemas-microsoft-com:office:word" xmlns:w="http://schemas.openxmlformats.org/wordprocessingml/2006/main" xmlns:w14="http://schemas.microsoft.com/office/word/2010/wordml" xmlns:w15="http://schemas.microsoft.com/office/word/2012/wordml" xmlns:wpg="http://schemas.microsoft.com/office/word/2010/wordprocessingGroup" xmlns:wpi="http://schemas.microsoft.com/office/word/2010/wordprocessingInk" xmlns:wne="http://schemas.microsoft.com/office/word/2006/wordml" xmlns:wps="http://schemas.microsoft.com/office/word/2010/wordprocessingShape" mc:Ignorable="w14 w15 wp14">
   <w:p>
     <w:pPr>
       <w:pStyle w:val="Header"/>
@@ -1555,7 +2046,7 @@
 </file>
 
 <file path=word/header2.xml><?xml version="1.0" encoding="utf-8"?>
-<w:hdr xmlns:wpc="http://schemas.microsoft.com/office/word/2010/wordprocessingCanvas" xmlns:cx="http://schemas.microsoft.com/office/drawing/2014/chartex" xmlns:cx1="http://schemas.microsoft.com/office/drawing/2015/9/8/chartex" xmlns:cx2="http://schemas.microsoft.com/office/drawing/2015/10/21/chartex" xmlns:cx3="http://schemas.microsoft.com/office/drawing/2016/5/9/chartex" xmlns:cx4="http://schemas.microsoft.com/office/drawing/2016/5/10/chartex" xmlns:cx5="http://schemas.microsoft.com/office/drawing/2016/5/11/chartex" xmlns:cx6="http://schemas.microsoft.com/office/drawing/2016/5/12/chartex" xmlns:cx7="http://schemas.microsoft.com/office/drawing/2016/5/13/chartex" xmlns:cx8="http://schemas.microsoft.com/office/drawing/2016/5/14/chartex" xmlns:mc="http://schemas.openxmlformats.org/markup-compatibility/2006" xmlns:aink="http://schemas.microsoft.com/office/drawing/2016/ink" xmlns:am3d="http://schemas.microsoft.com/office/drawing/2017/model3d" xmlns:o="urn:schemas-microsoft-com:office:office" xmlns:r="http://schemas.openxmlformats.org/officeDocument/2006/relationships" xmlns:m="http://schemas.openxmlformats.org/officeDocument/2006/math" xmlns:v="urn:schemas-microsoft-com:vml" xmlns:wp14="http://schemas.microsoft.com/office/word/2010/wordprocessingDrawing" xmlns:wp="http://schemas.openxmlformats.org/drawingml/2006/wordprocessingDrawing" xmlns:w10="urn:schemas-microsoft-com:office:word" xmlns:w="http://schemas.openxmlformats.org/wordprocessingml/2006/main" xmlns:w14="http://schemas.microsoft.com/office/word/2010/wordml" xmlns:w15="http://schemas.microsoft.com/office/word/2012/wordml" xmlns:w16cid="http://schemas.microsoft.com/office/word/2016/wordml/cid" xmlns:w16se="http://schemas.microsoft.com/office/word/2015/wordml/symex" xmlns:wpg="http://schemas.microsoft.com/office/word/2010/wordprocessingGroup" xmlns:wpi="http://schemas.microsoft.com/office/word/2010/wordprocessingInk" xmlns:wne="http://schemas.microsoft.com/office/word/2006/wordml" xmlns:wps="http://schemas.microsoft.com/office/word/2010/wordprocessingShape" mc:Ignorable="w14 w15 w16se w16cid wp14">
+<w:hdr xmlns:wpc="http://schemas.microsoft.com/office/word/2010/wordprocessingCanvas" xmlns:mo="http://schemas.microsoft.com/office/mac/office/2008/main" xmlns:mc="http://schemas.openxmlformats.org/markup-compatibility/2006" xmlns:mv="urn:schemas-microsoft-com:mac:vml" xmlns:o="urn:schemas-microsoft-com:office:office" xmlns:r="http://schemas.openxmlformats.org/officeDocument/2006/relationships" xmlns:m="http://schemas.openxmlformats.org/officeDocument/2006/math" xmlns:v="urn:schemas-microsoft-com:vml" xmlns:wp14="http://schemas.microsoft.com/office/word/2010/wordprocessingDrawing" xmlns:wp="http://schemas.openxmlformats.org/drawingml/2006/wordprocessingDrawing" xmlns:w10="urn:schemas-microsoft-com:office:word" xmlns:w="http://schemas.openxmlformats.org/wordprocessingml/2006/main" xmlns:w14="http://schemas.microsoft.com/office/word/2010/wordml" xmlns:w15="http://schemas.microsoft.com/office/word/2012/wordml" xmlns:wpg="http://schemas.microsoft.com/office/word/2010/wordprocessingGroup" xmlns:wpi="http://schemas.microsoft.com/office/word/2010/wordprocessingInk" xmlns:wne="http://schemas.microsoft.com/office/word/2006/wordml" xmlns:wps="http://schemas.microsoft.com/office/word/2010/wordprocessingShape" mc:Ignorable="w14 w15 wp14">
   <w:p>
     <w:pPr>
       <w:pStyle w:val="Header"/>
@@ -1565,7 +2056,7 @@
 </file>
 
 <file path=word/header3.xml><?xml version="1.0" encoding="utf-8"?>
-<w:hdr xmlns:wpc="http://schemas.microsoft.com/office/word/2010/wordprocessingCanvas" xmlns:cx="http://schemas.microsoft.com/office/drawing/2014/chartex" xmlns:cx1="http://schemas.microsoft.com/office/drawing/2015/9/8/chartex" xmlns:cx2="http://schemas.microsoft.com/office/drawing/2015/10/21/chartex" xmlns:cx3="http://schemas.microsoft.com/office/drawing/2016/5/9/chartex" xmlns:cx4="http://schemas.microsoft.com/office/drawing/2016/5/10/chartex" xmlns:cx5="http://schemas.microsoft.com/office/drawing/2016/5/11/chartex" xmlns:cx6="http://schemas.microsoft.com/office/drawing/2016/5/12/chartex" xmlns:cx7="http://schemas.microsoft.com/office/drawing/2016/5/13/chartex" xmlns:cx8="http://schemas.microsoft.com/office/drawing/2016/5/14/chartex" xmlns:mc="http://schemas.openxmlformats.org/markup-compatibility/2006" xmlns:aink="http://schemas.microsoft.com/office/drawing/2016/ink" xmlns:am3d="http://schemas.microsoft.com/office/drawing/2017/model3d" xmlns:o="urn:schemas-microsoft-com:office:office" xmlns:r="http://schemas.openxmlformats.org/officeDocument/2006/relationships" xmlns:m="http://schemas.openxmlformats.org/officeDocument/2006/math" xmlns:v="urn:schemas-microsoft-com:vml" xmlns:wp14="http://schemas.microsoft.com/office/word/2010/wordprocessingDrawing" xmlns:wp="http://schemas.openxmlformats.org/drawingml/2006/wordprocessingDrawing" xmlns:w10="urn:schemas-microsoft-com:office:word" xmlns:w="http://schemas.openxmlformats.org/wordprocessingml/2006/main" xmlns:w14="http://schemas.microsoft.com/office/word/2010/wordml" xmlns:w15="http://schemas.microsoft.com/office/word/2012/wordml" xmlns:w16cid="http://schemas.microsoft.com/office/word/2016/wordml/cid" xmlns:w16se="http://schemas.microsoft.com/office/word/2015/wordml/symex" xmlns:wpg="http://schemas.microsoft.com/office/word/2010/wordprocessingGroup" xmlns:wpi="http://schemas.microsoft.com/office/word/2010/wordprocessingInk" xmlns:wne="http://schemas.microsoft.com/office/word/2006/wordml" xmlns:wps="http://schemas.microsoft.com/office/word/2010/wordprocessingShape" mc:Ignorable="w14 w15 w16se w16cid wp14">
+<w:hdr xmlns:wpc="http://schemas.microsoft.com/office/word/2010/wordprocessingCanvas" xmlns:mo="http://schemas.microsoft.com/office/mac/office/2008/main" xmlns:mc="http://schemas.openxmlformats.org/markup-compatibility/2006" xmlns:mv="urn:schemas-microsoft-com:mac:vml" xmlns:o="urn:schemas-microsoft-com:office:office" xmlns:r="http://schemas.openxmlformats.org/officeDocument/2006/relationships" xmlns:m="http://schemas.openxmlformats.org/officeDocument/2006/math" xmlns:v="urn:schemas-microsoft-com:vml" xmlns:wp14="http://schemas.microsoft.com/office/word/2010/wordprocessingDrawing" xmlns:wp="http://schemas.openxmlformats.org/drawingml/2006/wordprocessingDrawing" xmlns:w10="urn:schemas-microsoft-com:office:word" xmlns:w="http://schemas.openxmlformats.org/wordprocessingml/2006/main" xmlns:w14="http://schemas.microsoft.com/office/word/2010/wordml" xmlns:w15="http://schemas.microsoft.com/office/word/2012/wordml" xmlns:wpg="http://schemas.microsoft.com/office/word/2010/wordprocessingGroup" xmlns:wpi="http://schemas.microsoft.com/office/word/2010/wordprocessingInk" xmlns:wne="http://schemas.microsoft.com/office/word/2006/wordml" xmlns:wps="http://schemas.microsoft.com/office/word/2010/wordprocessingShape" mc:Ignorable="w14 w15 wp14">
   <w:p>
     <w:pPr>
       <w:pStyle w:val="Header"/>
@@ -1575,8 +2066,8 @@
 </file>
 
 <file path=word/numbering.xml><?xml version="1.0" encoding="utf-8"?>
-<w:numbering xmlns:wpc="http://schemas.microsoft.com/office/word/2010/wordprocessingCanvas" xmlns:cx="http://schemas.microsoft.com/office/drawing/2014/chartex" xmlns:cx1="http://schemas.microsoft.com/office/drawing/2015/9/8/chartex" xmlns:cx2="http://schemas.microsoft.com/office/drawing/2015/10/21/chartex" xmlns:cx3="http://schemas.microsoft.com/office/drawing/2016/5/9/chartex" xmlns:cx4="http://schemas.microsoft.com/office/drawing/2016/5/10/chartex" xmlns:cx5="http://schemas.microsoft.com/office/drawing/2016/5/11/chartex" xmlns:cx6="http://schemas.microsoft.com/office/drawing/2016/5/12/chartex" xmlns:cx7="http://schemas.microsoft.com/office/drawing/2016/5/13/chartex" xmlns:cx8="http://schemas.microsoft.com/office/drawing/2016/5/14/chartex" xmlns:mc="http://schemas.openxmlformats.org/markup-compatibility/2006" xmlns:aink="http://schemas.microsoft.com/office/drawing/2016/ink" xmlns:am3d="http://schemas.microsoft.com/office/drawing/2017/model3d" xmlns:o="urn:schemas-microsoft-com:office:office" xmlns:r="http://schemas.openxmlformats.org/officeDocument/2006/relationships" xmlns:m="http://schemas.openxmlformats.org/officeDocument/2006/math" xmlns:v="urn:schemas-microsoft-com:vml" xmlns:wp14="http://schemas.microsoft.com/office/word/2010/wordprocessingDrawing" xmlns:wp="http://schemas.openxmlformats.org/drawingml/2006/wordprocessingDrawing" xmlns:w10="urn:schemas-microsoft-com:office:word" xmlns:w="http://schemas.openxmlformats.org/wordprocessingml/2006/main" xmlns:w14="http://schemas.microsoft.com/office/word/2010/wordml" xmlns:w15="http://schemas.microsoft.com/office/word/2012/wordml" xmlns:w16cid="http://schemas.microsoft.com/office/word/2016/wordml/cid" xmlns:w16se="http://schemas.microsoft.com/office/word/2015/wordml/symex" xmlns:wpg="http://schemas.microsoft.com/office/word/2010/wordprocessingGroup" xmlns:wpi="http://schemas.microsoft.com/office/word/2010/wordprocessingInk" xmlns:wne="http://schemas.microsoft.com/office/word/2006/wordml" xmlns:wps="http://schemas.microsoft.com/office/word/2010/wordprocessingShape" mc:Ignorable="w14 w15 w16se w16cid wp14">
-  <w:abstractNum w:abstractNumId="0" w15:restartNumberingAfterBreak="0">
+<w:numbering xmlns:wpc="http://schemas.microsoft.com/office/word/2010/wordprocessingCanvas" xmlns:mo="http://schemas.microsoft.com/office/mac/office/2008/main" xmlns:mc="http://schemas.openxmlformats.org/markup-compatibility/2006" xmlns:mv="urn:schemas-microsoft-com:mac:vml" xmlns:o="urn:schemas-microsoft-com:office:office" xmlns:r="http://schemas.openxmlformats.org/officeDocument/2006/relationships" xmlns:m="http://schemas.openxmlformats.org/officeDocument/2006/math" xmlns:v="urn:schemas-microsoft-com:vml" xmlns:wp14="http://schemas.microsoft.com/office/word/2010/wordprocessingDrawing" xmlns:wp="http://schemas.openxmlformats.org/drawingml/2006/wordprocessingDrawing" xmlns:w10="urn:schemas-microsoft-com:office:word" xmlns:w="http://schemas.openxmlformats.org/wordprocessingml/2006/main" xmlns:w14="http://schemas.microsoft.com/office/word/2010/wordml" xmlns:w15="http://schemas.microsoft.com/office/word/2012/wordml" xmlns:wpg="http://schemas.microsoft.com/office/word/2010/wordprocessingGroup" xmlns:wpi="http://schemas.microsoft.com/office/word/2010/wordprocessingInk" xmlns:wne="http://schemas.microsoft.com/office/word/2006/wordml" xmlns:wps="http://schemas.microsoft.com/office/word/2010/wordprocessingShape" mc:Ignorable="w14 w15 wp14">
+  <w:abstractNum w:abstractNumId="0">
     <w:nsid w:val="2E5B1CCF"/>
     <w:multiLevelType w:val="multilevel"/>
     <w:tmpl w:val="C0087224"/>
@@ -1695,8 +2186,16 @@
 </w:numbering>
 </file>
 
+<file path=word/people.xml><?xml version="1.0" encoding="utf-8"?>
+<w15:people xmlns:wpc="http://schemas.microsoft.com/office/word/2010/wordprocessingCanvas" xmlns:mo="http://schemas.microsoft.com/office/mac/office/2008/main" xmlns:mc="http://schemas.openxmlformats.org/markup-compatibility/2006" xmlns:mv="urn:schemas-microsoft-com:mac:vml" xmlns:o="urn:schemas-microsoft-com:office:office" xmlns:r="http://schemas.openxmlformats.org/officeDocument/2006/relationships" xmlns:m="http://schemas.openxmlformats.org/officeDocument/2006/math" xmlns:v="urn:schemas-microsoft-com:vml" xmlns:wp14="http://schemas.microsoft.com/office/word/2010/wordprocessingDrawing" xmlns:wp="http://schemas.openxmlformats.org/drawingml/2006/wordprocessingDrawing" xmlns:w10="urn:schemas-microsoft-com:office:word" xmlns:w="http://schemas.openxmlformats.org/wordprocessingml/2006/main" xmlns:w14="http://schemas.microsoft.com/office/word/2010/wordml" xmlns:w15="http://schemas.microsoft.com/office/word/2012/wordml" xmlns:wpg="http://schemas.microsoft.com/office/word/2010/wordprocessingGroup" xmlns:wpi="http://schemas.microsoft.com/office/word/2010/wordprocessingInk" xmlns:wne="http://schemas.microsoft.com/office/word/2006/wordml" xmlns:wps="http://schemas.microsoft.com/office/word/2010/wordprocessingShape" mc:Ignorable="w14 w15 wp14">
+  <w15:person w15:author="Gavin McDonald">
+    <w15:presenceInfo w15:providerId="None" w15:userId="Gavin McDonald"/>
+  </w15:person>
+</w15:people>
+</file>
+
 <file path=word/styles.xml><?xml version="1.0" encoding="utf-8"?>
-<w:styles xmlns:mc="http://schemas.openxmlformats.org/markup-compatibility/2006" xmlns:r="http://schemas.openxmlformats.org/officeDocument/2006/relationships" xmlns:w="http://schemas.openxmlformats.org/wordprocessingml/2006/main" xmlns:w14="http://schemas.microsoft.com/office/word/2010/wordml" xmlns:w15="http://schemas.microsoft.com/office/word/2012/wordml" xmlns:w16cid="http://schemas.microsoft.com/office/word/2016/wordml/cid" xmlns:w16se="http://schemas.microsoft.com/office/word/2015/wordml/symex" mc:Ignorable="w14 w15 w16se w16cid">
+<w:styles xmlns:mc="http://schemas.openxmlformats.org/markup-compatibility/2006" xmlns:r="http://schemas.openxmlformats.org/officeDocument/2006/relationships" xmlns:w="http://schemas.openxmlformats.org/wordprocessingml/2006/main" xmlns:w14="http://schemas.microsoft.com/office/word/2010/wordml" xmlns:w15="http://schemas.microsoft.com/office/word/2012/wordml" mc:Ignorable="w14 w15">
   <w:docDefaults>
     <w:rPrDefault>
       <w:rPr>
@@ -1713,7 +2212,7 @@
       </w:pPr>
     </w:pPrDefault>
   </w:docDefaults>
-  <w:latentStyles w:defLockedState="0" w:defUIPriority="99" w:defSemiHidden="0" w:defUnhideWhenUsed="0" w:defQFormat="0" w:count="375">
+  <w:latentStyles w:defLockedState="0" w:defUIPriority="99" w:defSemiHidden="0" w:defUnhideWhenUsed="0" w:defQFormat="0" w:count="382">
     <w:lsdException w:name="Normal" w:uiPriority="0" w:qFormat="1"/>
     <w:lsdException w:name="heading 1" w:uiPriority="9" w:qFormat="1"/>
     <w:lsdException w:name="heading 2" w:semiHidden="1" w:uiPriority="9" w:unhideWhenUsed="1" w:qFormat="1"/>
@@ -1868,7 +2367,7 @@
     <w:lsdException w:name="Table Web 2" w:semiHidden="1" w:unhideWhenUsed="1"/>
     <w:lsdException w:name="Table Web 3" w:semiHidden="1" w:unhideWhenUsed="1"/>
     <w:lsdException w:name="Balloon Text" w:semiHidden="1" w:unhideWhenUsed="1"/>
-    <w:lsdException w:name="Table Grid" w:semiHidden="1" w:uiPriority="59" w:unhideWhenUsed="1"/>
+    <w:lsdException w:name="Table Grid" w:uiPriority="59"/>
     <w:lsdException w:name="Table Theme" w:semiHidden="1" w:unhideWhenUsed="1"/>
     <w:lsdException w:name="Placeholder Text" w:semiHidden="1"/>
     <w:lsdException w:name="No Spacing" w:uiPriority="1" w:qFormat="1"/>
@@ -2087,8 +2586,6 @@
     <w:lsdException w:name="List Table 7 Colorful Accent 6" w:uiPriority="52"/>
     <w:lsdException w:name="Mention" w:semiHidden="1" w:unhideWhenUsed="1"/>
     <w:lsdException w:name="Smart Hyperlink" w:semiHidden="1" w:unhideWhenUsed="1"/>
-    <w:lsdException w:name="Hashtag" w:semiHidden="1" w:unhideWhenUsed="1"/>
-    <w:lsdException w:name="Unresolved Mention" w:semiHidden="1" w:unhideWhenUsed="1"/>
   </w:latentStyles>
   <w:style w:type="paragraph" w:default="1" w:styleId="Normal">
     <w:name w:val="Normal"/>
@@ -2329,6 +2826,36 @@
     <w:rsid w:val="00AE58E5"/>
     <w:rPr>
       <w:vertAlign w:val="superscript"/>
+    </w:rPr>
+  </w:style>
+  <w:style w:type="paragraph" w:styleId="BalloonText">
+    <w:name w:val="Balloon Text"/>
+    <w:basedOn w:val="Normal"/>
+    <w:link w:val="BalloonTextChar"/>
+    <w:uiPriority w:val="99"/>
+    <w:semiHidden/>
+    <w:unhideWhenUsed/>
+    <w:rsid w:val="002539FF"/>
+    <w:pPr>
+      <w:spacing w:line="240" w:lineRule="auto"/>
+    </w:pPr>
+    <w:rPr>
+      <w:rFonts w:ascii="Times New Roman" w:hAnsi="Times New Roman" w:cs="Times New Roman"/>
+      <w:sz w:val="18"/>
+      <w:szCs w:val="18"/>
+    </w:rPr>
+  </w:style>
+  <w:style w:type="character" w:customStyle="1" w:styleId="BalloonTextChar">
+    <w:name w:val="Balloon Text Char"/>
+    <w:basedOn w:val="DefaultParagraphFont"/>
+    <w:link w:val="BalloonText"/>
+    <w:uiPriority w:val="99"/>
+    <w:semiHidden/>
+    <w:rsid w:val="002539FF"/>
+    <w:rPr>
+      <w:rFonts w:ascii="Times New Roman" w:hAnsi="Times New Roman" w:cs="Times New Roman"/>
+      <w:sz w:val="18"/>
+      <w:szCs w:val="18"/>
     </w:rPr>
   </w:style>
 </w:styles>

</xml_diff>